<commit_message>
final? change to the documentation
</commit_message>
<xml_diff>
--- a/Docs/Project Documentation.docx
+++ b/Docs/Project Documentation.docx
@@ -79,7 +79,6 @@
           <w:bCs/>
         </w:rPr>
       </w:pPr>
-      <w:proofErr w:type="gramStart"/>
       <w:r>
         <w:rPr>
           <w:b/>
@@ -87,7 +86,6 @@
         </w:rPr>
         <w:t>By</w:t>
       </w:r>
-      <w:proofErr w:type="gramEnd"/>
     </w:p>
     <w:tbl>
       <w:tblPr>
@@ -208,21 +206,12 @@
                 <w:szCs w:val="20"/>
               </w:rPr>
             </w:pPr>
-            <w:proofErr w:type="spellStart"/>
             <w:r>
               <w:rPr>
                 <w:sz w:val="20"/>
                 <w:szCs w:val="20"/>
               </w:rPr>
-              <w:t>Mennatallah</w:t>
-            </w:r>
-            <w:proofErr w:type="spellEnd"/>
-            <w:r>
-              <w:rPr>
-                <w:sz w:val="20"/>
-                <w:szCs w:val="20"/>
-              </w:rPr>
-              <w:t xml:space="preserve"> Moustafa Ali</w:t>
+              <w:t>Mennatallah Moustafa Ali</w:t>
             </w:r>
           </w:p>
         </w:tc>
@@ -547,22 +536,22 @@
         </w:rPr>
         <w:t xml:space="preserve"> </w:t>
       </w:r>
-      <w:proofErr w:type="spellStart"/>
       <w:r>
         <w:rPr>
           <w:sz w:val="36"/>
           <w:szCs w:val="36"/>
         </w:rPr>
-        <w:t>Soaad</w:t>
-      </w:r>
-      <w:proofErr w:type="spellEnd"/>
-      <w:r>
+        <w:t>Soaad Mustafa</w:t>
+      </w:r>
+    </w:p>
+    <w:p>
+      <w:pPr>
+        <w:jc w:val="center"/>
         <w:rPr>
           <w:sz w:val="36"/>
           <w:szCs w:val="36"/>
         </w:rPr>
-        <w:t xml:space="preserve"> Mustafa</w:t>
-      </w:r>
+      </w:pPr>
     </w:p>
     <w:p>
       <w:pPr>
@@ -572,42 +561,40 @@
           <w:szCs w:val="36"/>
         </w:rPr>
       </w:pPr>
-    </w:p>
-    <w:p>
-      <w:pPr>
-        <w:jc w:val="center"/>
+      <w:r>
         <w:rPr>
           <w:sz w:val="36"/>
           <w:szCs w:val="36"/>
         </w:rPr>
-      </w:pPr>
+        <w:t>[</w:t>
+      </w:r>
       <w:r>
         <w:rPr>
           <w:sz w:val="36"/>
           <w:szCs w:val="36"/>
         </w:rPr>
-        <w:t>[</w:t>
+        <w:t>Menoufia</w:t>
       </w:r>
       <w:r>
         <w:rPr>
           <w:sz w:val="36"/>
           <w:szCs w:val="36"/>
         </w:rPr>
-        <w:t>Menoufia</w:t>
+        <w:t>]-</w:t>
       </w:r>
       <w:r>
         <w:rPr>
           <w:sz w:val="36"/>
           <w:szCs w:val="36"/>
         </w:rPr>
-        <w:t>]-</w:t>
+        <w:t>202</w:t>
       </w:r>
       <w:r>
         <w:rPr>
           <w:sz w:val="36"/>
           <w:szCs w:val="36"/>
         </w:rPr>
-        <w:t>2025</w:t>
+        <w:t>6</w:t>
       </w:r>
     </w:p>
     <w:p/>
@@ -742,57 +729,32 @@
           <w:b/>
           <w:bCs/>
         </w:rPr>
-        <w:t xml:space="preserve">Khaled </w:t>
-      </w:r>
-      <w:proofErr w:type="gramStart"/>
+        <w:t xml:space="preserve">Khaled Tawfik </w:t>
+      </w:r>
+      <w:r>
+        <w:t>for their invaluable guidance, continuous support, and insightful feedback throughout the development of this project. Their expertise and encouragement were instrumental in shaping our work.</w:t>
+      </w:r>
+    </w:p>
+    <w:p>
+      <w:pPr>
+        <w:jc w:val="left"/>
+      </w:pPr>
+      <w:r>
+        <w:t xml:space="preserve">We are also grateful to our teaching assistant, </w:t>
+      </w:r>
       <w:r>
         <w:rPr>
           <w:b/>
           <w:bCs/>
         </w:rPr>
-        <w:t>Tawfik</w:t>
-      </w:r>
-      <w:proofErr w:type="gramEnd"/>
+        <w:t xml:space="preserve">Eng. </w:t>
+      </w:r>
       <w:r>
         <w:rPr>
           <w:b/>
           <w:bCs/>
         </w:rPr>
-        <w:t xml:space="preserve"> </w:t>
-      </w:r>
-      <w:r>
-        <w:t>for their invaluable guidance, continuous support, and insightful feedback throughout the development of this project. Their expertise and encouragement were instrumental in shaping our work.</w:t>
-      </w:r>
-    </w:p>
-    <w:p>
-      <w:pPr>
-        <w:jc w:val="left"/>
-      </w:pPr>
-      <w:r>
-        <w:t xml:space="preserve">We are also grateful to our teaching assistant, </w:t>
-      </w:r>
-      <w:r>
-        <w:rPr>
-          <w:b/>
-          <w:bCs/>
-        </w:rPr>
-        <w:t xml:space="preserve">Eng. </w:t>
-      </w:r>
-      <w:proofErr w:type="spellStart"/>
-      <w:r>
-        <w:rPr>
-          <w:b/>
-          <w:bCs/>
-        </w:rPr>
-        <w:t>Soaad</w:t>
-      </w:r>
-      <w:proofErr w:type="spellEnd"/>
-      <w:r>
-        <w:rPr>
-          <w:b/>
-          <w:bCs/>
-        </w:rPr>
-        <w:t xml:space="preserve"> Mustafa</w:t>
+        <w:t>Soaad Mustafa</w:t>
       </w:r>
       <w:r>
         <w:t>, for their technical assistance, practical advice, and dedication in helping us overcome the challenges we encountered during implementation.</w:t>
@@ -1196,41 +1158,7 @@
                 <w:noProof/>
                 <w:webHidden/>
               </w:rPr>
-              <w:fldChar w:fldCharType="begin"/>
-            </w:r>
-            <w:r>
-              <w:rPr>
-                <w:noProof/>
-                <w:webHidden/>
-              </w:rPr>
-              <w:instrText xml:space="preserve"> PAGEREF _Toc197463973 \h </w:instrText>
-            </w:r>
-            <w:r>
-              <w:rPr>
-                <w:noProof/>
-                <w:webHidden/>
-              </w:rPr>
-            </w:r>
-            <w:r>
-              <w:rPr>
-                <w:noProof/>
-                <w:webHidden/>
-              </w:rPr>
-              <w:fldChar w:fldCharType="separate"/>
-            </w:r>
-            <w:r>
-              <w:rPr>
-                <w:noProof/>
-                <w:webHidden/>
-              </w:rPr>
-              <w:t>7</w:t>
-            </w:r>
-            <w:r>
-              <w:rPr>
-                <w:noProof/>
-                <w:webHidden/>
-              </w:rPr>
-              <w:fldChar w:fldCharType="end"/>
+              <w:t>9</w:t>
             </w:r>
           </w:hyperlink>
         </w:p>
@@ -1265,41 +1193,7 @@
                 <w:noProof/>
                 <w:webHidden/>
               </w:rPr>
-              <w:fldChar w:fldCharType="begin"/>
-            </w:r>
-            <w:r>
-              <w:rPr>
-                <w:noProof/>
-                <w:webHidden/>
-              </w:rPr>
-              <w:instrText xml:space="preserve"> PAGEREF _Toc197463974 \h </w:instrText>
-            </w:r>
-            <w:r>
-              <w:rPr>
-                <w:noProof/>
-                <w:webHidden/>
-              </w:rPr>
-            </w:r>
-            <w:r>
-              <w:rPr>
-                <w:noProof/>
-                <w:webHidden/>
-              </w:rPr>
-              <w:fldChar w:fldCharType="separate"/>
-            </w:r>
-            <w:r>
-              <w:rPr>
-                <w:noProof/>
-                <w:webHidden/>
-              </w:rPr>
-              <w:t>9</w:t>
-            </w:r>
-            <w:r>
-              <w:rPr>
-                <w:noProof/>
-                <w:webHidden/>
-              </w:rPr>
-              <w:fldChar w:fldCharType="end"/>
+              <w:t>14</w:t>
             </w:r>
           </w:hyperlink>
         </w:p>
@@ -1334,41 +1228,7 @@
                 <w:noProof/>
                 <w:webHidden/>
               </w:rPr>
-              <w:fldChar w:fldCharType="begin"/>
-            </w:r>
-            <w:r>
-              <w:rPr>
-                <w:noProof/>
-                <w:webHidden/>
-              </w:rPr>
-              <w:instrText xml:space="preserve"> PAGEREF _Toc197463975 \h </w:instrText>
-            </w:r>
-            <w:r>
-              <w:rPr>
-                <w:noProof/>
-                <w:webHidden/>
-              </w:rPr>
-            </w:r>
-            <w:r>
-              <w:rPr>
-                <w:noProof/>
-                <w:webHidden/>
-              </w:rPr>
-              <w:fldChar w:fldCharType="separate"/>
-            </w:r>
-            <w:r>
-              <w:rPr>
-                <w:noProof/>
-                <w:webHidden/>
-              </w:rPr>
-              <w:t>11</w:t>
-            </w:r>
-            <w:r>
-              <w:rPr>
-                <w:noProof/>
-                <w:webHidden/>
-              </w:rPr>
-              <w:fldChar w:fldCharType="end"/>
+              <w:t>19</w:t>
             </w:r>
           </w:hyperlink>
         </w:p>
@@ -1403,41 +1263,7 @@
                 <w:noProof/>
                 <w:webHidden/>
               </w:rPr>
-              <w:fldChar w:fldCharType="begin"/>
-            </w:r>
-            <w:r>
-              <w:rPr>
-                <w:noProof/>
-                <w:webHidden/>
-              </w:rPr>
-              <w:instrText xml:space="preserve"> PAGEREF _Toc197463976 \h </w:instrText>
-            </w:r>
-            <w:r>
-              <w:rPr>
-                <w:noProof/>
-                <w:webHidden/>
-              </w:rPr>
-            </w:r>
-            <w:r>
-              <w:rPr>
-                <w:noProof/>
-                <w:webHidden/>
-              </w:rPr>
-              <w:fldChar w:fldCharType="separate"/>
-            </w:r>
-            <w:r>
-              <w:rPr>
-                <w:noProof/>
-                <w:webHidden/>
-              </w:rPr>
-              <w:t>13</w:t>
-            </w:r>
-            <w:r>
-              <w:rPr>
-                <w:noProof/>
-                <w:webHidden/>
-              </w:rPr>
-              <w:fldChar w:fldCharType="end"/>
+              <w:t>28</w:t>
             </w:r>
           </w:hyperlink>
         </w:p>
@@ -1472,41 +1298,7 @@
                 <w:noProof/>
                 <w:webHidden/>
               </w:rPr>
-              <w:fldChar w:fldCharType="begin"/>
-            </w:r>
-            <w:r>
-              <w:rPr>
-                <w:noProof/>
-                <w:webHidden/>
-              </w:rPr>
-              <w:instrText xml:space="preserve"> PAGEREF _Toc197463977 \h </w:instrText>
-            </w:r>
-            <w:r>
-              <w:rPr>
-                <w:noProof/>
-                <w:webHidden/>
-              </w:rPr>
-            </w:r>
-            <w:r>
-              <w:rPr>
-                <w:noProof/>
-                <w:webHidden/>
-              </w:rPr>
-              <w:fldChar w:fldCharType="separate"/>
-            </w:r>
-            <w:r>
-              <w:rPr>
-                <w:noProof/>
-                <w:webHidden/>
-              </w:rPr>
-              <w:t>15</w:t>
-            </w:r>
-            <w:r>
-              <w:rPr>
-                <w:noProof/>
-                <w:webHidden/>
-              </w:rPr>
-              <w:fldChar w:fldCharType="end"/>
+              <w:t>37</w:t>
             </w:r>
           </w:hyperlink>
         </w:p>
@@ -1541,41 +1333,7 @@
                 <w:noProof/>
                 <w:webHidden/>
               </w:rPr>
-              <w:fldChar w:fldCharType="begin"/>
-            </w:r>
-            <w:r>
-              <w:rPr>
-                <w:noProof/>
-                <w:webHidden/>
-              </w:rPr>
-              <w:instrText xml:space="preserve"> PAGEREF _Toc197463978 \h </w:instrText>
-            </w:r>
-            <w:r>
-              <w:rPr>
-                <w:noProof/>
-                <w:webHidden/>
-              </w:rPr>
-            </w:r>
-            <w:r>
-              <w:rPr>
-                <w:noProof/>
-                <w:webHidden/>
-              </w:rPr>
-              <w:fldChar w:fldCharType="separate"/>
-            </w:r>
-            <w:r>
-              <w:rPr>
-                <w:noProof/>
-                <w:webHidden/>
-              </w:rPr>
-              <w:t>17</w:t>
-            </w:r>
-            <w:r>
-              <w:rPr>
-                <w:noProof/>
-                <w:webHidden/>
-              </w:rPr>
-              <w:fldChar w:fldCharType="end"/>
+              <w:t>40</w:t>
             </w:r>
           </w:hyperlink>
         </w:p>
@@ -1610,41 +1368,7 @@
                 <w:noProof/>
                 <w:webHidden/>
               </w:rPr>
-              <w:fldChar w:fldCharType="begin"/>
-            </w:r>
-            <w:r>
-              <w:rPr>
-                <w:noProof/>
-                <w:webHidden/>
-              </w:rPr>
-              <w:instrText xml:space="preserve"> PAGEREF _Toc197463979 \h </w:instrText>
-            </w:r>
-            <w:r>
-              <w:rPr>
-                <w:noProof/>
-                <w:webHidden/>
-              </w:rPr>
-            </w:r>
-            <w:r>
-              <w:rPr>
-                <w:noProof/>
-                <w:webHidden/>
-              </w:rPr>
-              <w:fldChar w:fldCharType="separate"/>
-            </w:r>
-            <w:r>
-              <w:rPr>
-                <w:noProof/>
-                <w:webHidden/>
-              </w:rPr>
-              <w:t>19</w:t>
-            </w:r>
-            <w:r>
-              <w:rPr>
-                <w:noProof/>
-                <w:webHidden/>
-              </w:rPr>
-              <w:fldChar w:fldCharType="end"/>
+              <w:t>42</w:t>
             </w:r>
           </w:hyperlink>
         </w:p>
@@ -1679,41 +1403,7 @@
                 <w:noProof/>
                 <w:webHidden/>
               </w:rPr>
-              <w:fldChar w:fldCharType="begin"/>
-            </w:r>
-            <w:r>
-              <w:rPr>
-                <w:noProof/>
-                <w:webHidden/>
-              </w:rPr>
-              <w:instrText xml:space="preserve"> PAGEREF _Toc197463980 \h </w:instrText>
-            </w:r>
-            <w:r>
-              <w:rPr>
-                <w:noProof/>
-                <w:webHidden/>
-              </w:rPr>
-            </w:r>
-            <w:r>
-              <w:rPr>
-                <w:noProof/>
-                <w:webHidden/>
-              </w:rPr>
-              <w:fldChar w:fldCharType="separate"/>
-            </w:r>
-            <w:r>
-              <w:rPr>
-                <w:noProof/>
-                <w:webHidden/>
-              </w:rPr>
-              <w:t>21</w:t>
-            </w:r>
-            <w:r>
-              <w:rPr>
-                <w:noProof/>
-                <w:webHidden/>
-              </w:rPr>
-              <w:fldChar w:fldCharType="end"/>
+              <w:t>43</w:t>
             </w:r>
           </w:hyperlink>
         </w:p>
@@ -1815,42 +1505,17 @@
           <w:i/>
           <w:iCs/>
         </w:rPr>
-        <w:t xml:space="preserve">Too Good </w:t>
-      </w:r>
-      <w:proofErr w:type="gramStart"/>
+        <w:t>Too Good To Go</w:t>
+      </w:r>
+      <w:r>
+        <w:t xml:space="preserve">, and limited local attempts have been made through apps like </w:t>
+      </w:r>
       <w:r>
         <w:rPr>
           <w:i/>
           <w:iCs/>
         </w:rPr>
-        <w:t>To</w:t>
-      </w:r>
-      <w:proofErr w:type="gramEnd"/>
-      <w:r>
-        <w:rPr>
-          <w:i/>
-          <w:iCs/>
-        </w:rPr>
-        <w:t xml:space="preserve"> Go</w:t>
-      </w:r>
-      <w:r>
-        <w:t xml:space="preserve">, and limited local attempts have been made through apps like </w:t>
-      </w:r>
-      <w:proofErr w:type="spellStart"/>
-      <w:r>
-        <w:rPr>
-          <w:i/>
-          <w:iCs/>
-        </w:rPr>
-        <w:t>Kasbanah</w:t>
-      </w:r>
-      <w:proofErr w:type="spellEnd"/>
-      <w:r>
-        <w:rPr>
-          <w:i/>
-          <w:iCs/>
-        </w:rPr>
-        <w:t xml:space="preserve"> </w:t>
+        <w:t xml:space="preserve">Kasbanah </w:t>
       </w:r>
       <w:r>
         <w:t xml:space="preserve">and </w:t>
@@ -1952,15 +1617,7 @@
         <w:ind w:left="360"/>
       </w:pPr>
       <w:r>
-        <w:t xml:space="preserve">Existing platforms such as </w:t>
-      </w:r>
-      <w:proofErr w:type="spellStart"/>
-      <w:r>
-        <w:t>Kasbanah</w:t>
-      </w:r>
-      <w:proofErr w:type="spellEnd"/>
-      <w:r>
-        <w:t xml:space="preserve"> and Mystery Bag have demonstrated proof of concept but failed to achieve market penetration. Vendors remain unaware of these solutions, and </w:t>
+        <w:t xml:space="preserve">Existing platforms such as Kasbanah and Mystery Bag have demonstrated proof of concept but failed to achieve market penetration. Vendors remain unaware of these solutions, and </w:t>
       </w:r>
       <w:r>
         <w:lastRenderedPageBreak/>
@@ -2171,15 +1828,7 @@
         <w:ind w:left="360"/>
       </w:pPr>
       <w:r>
-        <w:t xml:space="preserve">This project proposes a comprehensive Food Rescue Platform addressing the food waste problem through financial incentive rather than relying solely on charitable donation. International success stories such as Too Good </w:t>
-      </w:r>
-      <w:proofErr w:type="gramStart"/>
-      <w:r>
-        <w:t>To</w:t>
-      </w:r>
-      <w:proofErr w:type="gramEnd"/>
-      <w:r>
-        <w:t xml:space="preserve"> Go demonstrate that vendor participation increases significantly when platforms offer revenue recovery rather than expecting pure altruism. Vendors receive payment for products that would otherwise represent total loss, creating a sustainable business model that encourages ongoing participation.</w:t>
+        <w:t>This project proposes a comprehensive Food Rescue Platform addressing the food waste problem through financial incentive rather than relying solely on charitable donation. International success stories such as Too Good To Go demonstrate that vendor participation increases significantly when platforms offer revenue recovery rather than expecting pure altruism. Vendors receive payment for products that would otherwise represent total loss, creating a sustainable business model that encourages ongoing participation.</w:t>
       </w:r>
     </w:p>
     <w:p>
@@ -2195,15 +1844,7 @@
         <w:ind w:left="360"/>
       </w:pPr>
       <w:r>
-        <w:t xml:space="preserve">The solution targets major Egyptian cities where smartphone penetration is high and residents are already familiar with delivery and marketplace applications such as </w:t>
-      </w:r>
-      <w:proofErr w:type="spellStart"/>
-      <w:r>
-        <w:t>Talabat</w:t>
-      </w:r>
-      <w:proofErr w:type="spellEnd"/>
-      <w:r>
-        <w:t>. However, unlike delivery platforms, this system requires customer pickup at vendor locations, simplifying logistics and reducing operational costs. The platform will be technically available nationwide, allowing organic expansion as awareness grows beyond initial urban markets.</w:t>
+        <w:t>The solution targets major Egyptian cities where smartphone penetration is high and residents are already familiar with delivery and marketplace applications such as Talabat. However, unlike delivery platforms, this system requires customer pickup at vendor locations, simplifying logistics and reducing operational costs. The platform will be technically available nationwide, allowing organic expansion as awareness grows beyond initial urban markets.</w:t>
       </w:r>
     </w:p>
     <w:p>
@@ -2213,21 +1854,11 @@
       <w:r>
         <w:t xml:space="preserve">By combining vendor financial </w:t>
       </w:r>
-      <w:proofErr w:type="gramStart"/>
       <w:r>
         <w:t>incentive</w:t>
       </w:r>
-      <w:proofErr w:type="gramEnd"/>
-      <w:r>
-        <w:t xml:space="preserve">, customer value </w:t>
-      </w:r>
-      <w:proofErr w:type="gramStart"/>
-      <w:r>
-        <w:t>proposition</w:t>
-      </w:r>
-      <w:proofErr w:type="gramEnd"/>
-      <w:r>
-        <w:t>, charitable partnership options, and AI-powered quality assurance, this platform addresses the multifaceted nature of food waste while creating a sustainable ecosystem that benefits all stakeholders</w:t>
+      <w:r>
+        <w:t>, customer value proposition, charitable partnership options, and AI-powered quality assurance, this platform addresses the multifaceted nature of food waste while creating a sustainable ecosystem that benefits all stakeholders</w:t>
       </w:r>
     </w:p>
     <w:p>
@@ -2298,46 +1929,22 @@
           <w:b/>
           <w:bCs/>
         </w:rPr>
-        <w:t xml:space="preserve">Too Good </w:t>
-      </w:r>
-      <w:proofErr w:type="gramStart"/>
+        <w:t>Too Good To Go</w:t>
+      </w:r>
+      <w:r>
+        <w:t xml:space="preserve"> stands as the current market leader in food rescue applications, demonstrating the viability and scalability of the surplus food marketplace model. As of 2022, the platform had grown to over 57.7 million users and 154,000 partner establishments, successfully rescuing 139 million meals from waste. The platform's success stems from its "surprise bag" model, where customers purchase mystery boxes of surplus food at approximately one-third of the original price. In 2023 alone, Too Good To Go saved over 100 million meals in the UK, representing a 46 percent increase from the previous year. The platform's expansion across 20 countries demonstrates the universal applicability of the food rescue concept, though notably, no presence exists in the Middle East or North Africa region.</w:t>
+      </w:r>
+    </w:p>
+    <w:p>
+      <w:pPr>
+        <w:ind w:left="720"/>
+        <w:jc w:val="left"/>
+      </w:pPr>
       <w:r>
         <w:rPr>
           <w:b/>
           <w:bCs/>
         </w:rPr>
-        <w:t>To</w:t>
-      </w:r>
-      <w:proofErr w:type="gramEnd"/>
-      <w:r>
-        <w:rPr>
-          <w:b/>
-          <w:bCs/>
-        </w:rPr>
-        <w:t xml:space="preserve"> Go</w:t>
-      </w:r>
-      <w:r>
-        <w:t xml:space="preserve"> stands as the current market leader in food rescue applications, demonstrating the viability and scalability of the surplus food marketplace model. As of 2022, the platform had grown to over 57.7 million users and 154,000 partner establishments, successfully rescuing 139 million meals from waste. The platform's success stems from its "surprise bag" model, where customers purchase mystery boxes of surplus food at approximately one-third of the original price. In 2023 alone, Too Good </w:t>
-      </w:r>
-      <w:proofErr w:type="gramStart"/>
-      <w:r>
-        <w:t>To</w:t>
-      </w:r>
-      <w:proofErr w:type="gramEnd"/>
-      <w:r>
-        <w:t xml:space="preserve"> Go saved over 100 million meals in the UK, representing a 46 percent increase from the previous year. The platform's expansion across 20 countries demonstrates the universal applicability of the food rescue concept, though notably, no presence exists in the Middle East or North Africa region.</w:t>
-      </w:r>
-    </w:p>
-    <w:p>
-      <w:pPr>
-        <w:ind w:left="720"/>
-        <w:jc w:val="left"/>
-      </w:pPr>
-      <w:r>
-        <w:rPr>
-          <w:b/>
-          <w:bCs/>
-        </w:rPr>
         <w:t>Olio</w:t>
       </w:r>
       <w:r>
@@ -2345,15 +1952,7 @@
       </w:r>
       <w:r>
         <w:lastRenderedPageBreak/>
-        <w:t xml:space="preserve">building engagement, with the platform reporting that two-thirds of </w:t>
-      </w:r>
-      <w:proofErr w:type="gramStart"/>
-      <w:r>
-        <w:t>users</w:t>
-      </w:r>
-      <w:proofErr w:type="gramEnd"/>
-      <w:r>
-        <w:t xml:space="preserve"> experience improved mental health and sense of connection through participation.</w:t>
+        <w:t>building engagement, with the platform reporting that two-thirds of users experience improved mental health and sense of connection through participation.</w:t>
       </w:r>
     </w:p>
     <w:p>
@@ -2413,15 +2012,7 @@
         <w:t>Tekeya</w:t>
       </w:r>
       <w:r>
-        <w:t xml:space="preserve">, launched in 2019 by Menna Shahin, represents Egypt's pioneering effort in food waste technology. The platform connects restaurants with consumers, allowing meals to be purchased at half price or donated to charitable organizations. The app includes an AI-powered system to help restaurants calculate food waste and receive suggestions for </w:t>
-      </w:r>
-      <w:proofErr w:type="gramStart"/>
-      <w:r>
-        <w:t>reduction</w:t>
-      </w:r>
-      <w:proofErr w:type="gramEnd"/>
-      <w:r>
-        <w:t xml:space="preserve">. However, despite early </w:t>
+        <w:t xml:space="preserve">, launched in 2019 by Menna Shahin, represents Egypt's pioneering effort in food waste technology. The platform connects restaurants with consumers, allowing meals to be purchased at half price or donated to charitable organizations. The app includes an AI-powered system to help restaurants calculate food waste and receive suggestions for reduction. However, despite early </w:t>
       </w:r>
       <w:r>
         <w:t>promises</w:t>
@@ -2435,7 +2026,6 @@
         <w:ind w:left="720"/>
         <w:jc w:val="left"/>
       </w:pPr>
-      <w:proofErr w:type="spellStart"/>
       <w:r>
         <w:rPr>
           <w:b/>
@@ -2443,33 +2033,8 @@
         </w:rPr>
         <w:t>Kasbanah</w:t>
       </w:r>
-      <w:proofErr w:type="spellEnd"/>
-      <w:r>
-        <w:t xml:space="preserve">, founded by Youssef Nour after encountering similar platforms while studying in the UK, has achieved more substantial traction. The platform now boasts over 150,000 users and operates a "Secret Bag" model </w:t>
-      </w:r>
-      <w:proofErr w:type="gramStart"/>
-      <w:r>
-        <w:t>similar to</w:t>
-      </w:r>
-      <w:proofErr w:type="gramEnd"/>
-      <w:r>
-        <w:t xml:space="preserve"> Too Good </w:t>
-      </w:r>
-      <w:proofErr w:type="gramStart"/>
-      <w:r>
-        <w:t>To</w:t>
-      </w:r>
-      <w:proofErr w:type="gramEnd"/>
-      <w:r>
-        <w:t xml:space="preserve"> Go's surprise bag concept. </w:t>
-      </w:r>
-      <w:proofErr w:type="spellStart"/>
-      <w:r>
-        <w:t>Kasbanah's</w:t>
-      </w:r>
-      <w:proofErr w:type="spellEnd"/>
-      <w:r>
-        <w:t xml:space="preserve"> homegrown approach and focus on the Cairo market demonstrates that adapted international models can achieve meaningful adoption in Egypt when properly localized.</w:t>
+      <w:r>
+        <w:t>, founded by Youssef Nour after encountering similar platforms while studying in the UK, has achieved more substantial traction. The platform now boasts over 150,000 users and operates a "Secret Bag" model similar to Too Good To Go's surprise bag concept. Kasbanah's homegrown approach and focus on the Cairo market demonstrates that adapted international models can achieve meaningful adoption in Egypt when properly localized.</w:t>
       </w:r>
     </w:p>
     <w:p>
@@ -2553,15 +2118,7 @@
         <w:jc w:val="left"/>
       </w:pPr>
       <w:r>
-        <w:t xml:space="preserve">AI's role in waste prevention through predictive analytics has shown promising results in retail and restaurant settings. Modern AI systems analyze historical sales, seasonal trends, promotions, and local considerations like weather or events to recommend precise production quantities, addressing waste at its source. Platforms like </w:t>
-      </w:r>
-      <w:proofErr w:type="spellStart"/>
-      <w:r>
-        <w:t>Leanpath</w:t>
-      </w:r>
-      <w:proofErr w:type="spellEnd"/>
-      <w:r>
-        <w:t xml:space="preserve"> and Winnow utilize track-discover-drive methodologies combined with AI-enhanced coaching tips to help establishments identify waste sources and take actionable steps. These predictive capabilities, when applied to food rescue platforms, could enable </w:t>
+        <w:t xml:space="preserve">AI's role in waste prevention through predictive analytics has shown promising results in retail and restaurant settings. Modern AI systems analyze historical sales, seasonal trends, promotions, and local considerations like weather or events to recommend precise production quantities, addressing waste at its source. Platforms like Leanpath and Winnow utilize track-discover-drive methodologies combined with AI-enhanced coaching tips to help establishments identify waste sources and take actionable steps. These predictive capabilities, when applied to food rescue platforms, could enable </w:t>
       </w:r>
       <w:r>
         <w:lastRenderedPageBreak/>
@@ -2607,23 +2164,7 @@
         <w:jc w:val="left"/>
       </w:pPr>
       <w:r>
-        <w:t xml:space="preserve">A comprehensive analysis of five major international platforms (Too Good </w:t>
-      </w:r>
-      <w:proofErr w:type="gramStart"/>
-      <w:r>
-        <w:t>To</w:t>
-      </w:r>
-      <w:proofErr w:type="gramEnd"/>
-      <w:r>
-        <w:t xml:space="preserve"> Go, Kashrut, Olio, Karma, and </w:t>
-      </w:r>
-      <w:proofErr w:type="spellStart"/>
-      <w:r>
-        <w:t>Flashfood</w:t>
-      </w:r>
-      <w:proofErr w:type="spellEnd"/>
-      <w:r>
-        <w:t>) reveals several critical gaps in current food rescue technology.</w:t>
+        <w:t>A comprehensive analysis of five major international platforms (Too Good To Go, Kashrut, Olio, Karma, and Flashfood) reveals several critical gaps in current food rescue technology.</w:t>
       </w:r>
     </w:p>
     <w:p>
@@ -2673,15 +2214,7 @@
         <w:jc w:val="left"/>
       </w:pPr>
       <w:r>
-        <w:t xml:space="preserve">Among the five </w:t>
-      </w:r>
-      <w:proofErr w:type="gramStart"/>
-      <w:r>
-        <w:t>analyzed platforms</w:t>
-      </w:r>
-      <w:proofErr w:type="gramEnd"/>
-      <w:r>
-        <w:t xml:space="preserve">, only two (Kashrut and Olio) offer delivery options, with most requiring customer pickup. While pickup-based models reduce operational complexity, the lack of delivery limits accessibility for users without transportation and reduces convenience during adverse conditions. The gap between customer expectations </w:t>
+        <w:t xml:space="preserve">Among the five analyzed platforms, only two (Kashrut and Olio) offer delivery options, with most requiring customer pickup. While pickup-based models reduce operational complexity, the lack of delivery limits accessibility for users without transportation and reduces convenience during adverse conditions. The gap between customer expectations </w:t>
       </w:r>
       <w:r>
         <w:lastRenderedPageBreak/>
@@ -2710,15 +2243,7 @@
         <w:jc w:val="left"/>
       </w:pPr>
       <w:r>
-        <w:t xml:space="preserve">International food rescue platforms have achieved significant success in Europe and North America but remain virtually absent from developing regions including the Middle East and North Africa. Egypt, despite ranking among the world's highest per-capita food waste producers, has seen limited platform adoption. The few existing Egyptian platforms (Tekeya, </w:t>
-      </w:r>
-      <w:proofErr w:type="spellStart"/>
-      <w:r>
-        <w:t>Kasbanah</w:t>
-      </w:r>
-      <w:proofErr w:type="spellEnd"/>
-      <w:r>
-        <w:t>, Mystery Bag) collectively represent fewer than 200,000 users despite serving a metropolitan Cairo population exceeding 20 million. This gap suggests not just market opportunity but also potential challenges unique to developing economies that require tailored solutions.</w:t>
+        <w:t>International food rescue platforms have achieved significant success in Europe and North America but remain virtually absent from developing regions including the Middle East and North Africa. Egypt, despite ranking among the world's highest per-capita food waste producers, has seen limited platform adoption. The few existing Egyptian platforms (Tekeya, Kasbanah, Mystery Bag) collectively represent fewer than 200,000 users despite serving a metropolitan Cairo population exceeding 20 million. This gap suggests not just market opportunity but also potential challenges unique to developing economies that require tailored solutions.</w:t>
       </w:r>
     </w:p>
     <w:p>
@@ -2735,15 +2260,7 @@
         <w:jc w:val="left"/>
       </w:pPr>
       <w:r>
-        <w:t xml:space="preserve">The literature reveals a maturing food rescue technology sector internationally, led by platforms like Too Good </w:t>
-      </w:r>
-      <w:proofErr w:type="gramStart"/>
-      <w:r>
-        <w:t>To</w:t>
-      </w:r>
-      <w:proofErr w:type="gramEnd"/>
-      <w:r>
-        <w:t xml:space="preserve"> Go that have demonstrated both technical viability and business sustainability. However, significant gaps persist particularly in AI integration, where proven waste management technologies have not been adapted for consumer marketplace applications. The Egyptian market presents unique challenges including cultural perceptions of surplus food and limited digital payment adoption, but also represents substantial opportunity given the country's high waste rates and underserved urban populations. The convergence of these factors suggests that a platform combining proven international marketplace models with novel AI-driven features tailored to local market conditions could address unmet needs while differentiating from existing solutions.</w:t>
+        <w:t>The literature reveals a maturing food rescue technology sector internationally, led by platforms like Too Good To Go that have demonstrated both technical viability and business sustainability. However, significant gaps persist particularly in AI integration, where proven waste management technologies have not been adapted for consumer marketplace applications. The Egyptian market presents unique challenges including cultural perceptions of surplus food and limited digital payment adoption, but also represents substantial opportunity given the country's high waste rates and underserved urban populations. The convergence of these factors suggests that a platform combining proven international marketplace models with novel AI-driven features tailored to local market conditions could address unmet needs while differentiating from existing solutions.</w:t>
       </w:r>
     </w:p>
     <w:p>
@@ -3046,40 +2563,48 @@
           <w:sz w:val="20"/>
           <w:szCs w:val="20"/>
         </w:rPr>
-        <w:t xml:space="preserve">Figure 3.2: Database Schema showing entities (Users, vendors, products, Orders, </w:t>
-      </w:r>
-      <w:proofErr w:type="spellStart"/>
-      <w:r>
+        <w:t>Figure 3.2: Database Schema showing entities (Users, vendors, products, Orders, OrderItems, Reviews, reports, Donations, PasswordResetTokens) and their relationships</w:t>
+      </w:r>
+    </w:p>
+    <w:p>
+      <w:pPr>
+        <w:spacing w:line="278" w:lineRule="auto"/>
+        <w:jc w:val="left"/>
         <w:rPr>
           <w:sz w:val="20"/>
           <w:szCs w:val="20"/>
         </w:rPr>
-        <w:t>OrderItems</w:t>
-      </w:r>
-      <w:proofErr w:type="spellEnd"/>
-      <w:r>
+      </w:pPr>
+    </w:p>
+    <w:p>
+      <w:pPr>
+        <w:spacing w:line="278" w:lineRule="auto"/>
+        <w:jc w:val="left"/>
         <w:rPr>
           <w:sz w:val="20"/>
           <w:szCs w:val="20"/>
         </w:rPr>
-        <w:t xml:space="preserve">, Reviews, reports, Donations, </w:t>
-      </w:r>
-      <w:proofErr w:type="spellStart"/>
-      <w:r>
+      </w:pPr>
+    </w:p>
+    <w:p>
+      <w:pPr>
+        <w:spacing w:line="278" w:lineRule="auto"/>
+        <w:jc w:val="left"/>
         <w:rPr>
           <w:sz w:val="20"/>
           <w:szCs w:val="20"/>
         </w:rPr>
-        <w:t>PasswordResetTokens</w:t>
-      </w:r>
-      <w:proofErr w:type="spellEnd"/>
-      <w:r>
+      </w:pPr>
+    </w:p>
+    <w:p>
+      <w:pPr>
+        <w:spacing w:line="278" w:lineRule="auto"/>
+        <w:jc w:val="left"/>
         <w:rPr>
           <w:sz w:val="20"/>
           <w:szCs w:val="20"/>
         </w:rPr>
-        <w:t>) and their relationships</w:t>
-      </w:r>
+      </w:pPr>
     </w:p>
     <w:p>
       <w:pPr>
@@ -3145,65 +2670,25 @@
       <w:pPr>
         <w:spacing w:line="278" w:lineRule="auto"/>
         <w:jc w:val="left"/>
-        <w:rPr>
-          <w:sz w:val="20"/>
-          <w:szCs w:val="20"/>
-        </w:rPr>
-      </w:pPr>
+      </w:pPr>
+      <w:r>
+        <w:t>3.2.3 Sequence Diagram</w:t>
+      </w:r>
+      <w:r>
+        <w:t xml:space="preserve"> (User purchase)</w:t>
+      </w:r>
     </w:p>
     <w:p>
       <w:pPr>
         <w:spacing w:line="278" w:lineRule="auto"/>
         <w:jc w:val="left"/>
-        <w:rPr>
-          <w:sz w:val="20"/>
-          <w:szCs w:val="20"/>
-        </w:rPr>
-      </w:pPr>
-    </w:p>
-    <w:p>
-      <w:pPr>
-        <w:spacing w:line="278" w:lineRule="auto"/>
-        <w:jc w:val="left"/>
-        <w:rPr>
-          <w:sz w:val="20"/>
-          <w:szCs w:val="20"/>
-        </w:rPr>
-      </w:pPr>
-    </w:p>
-    <w:p>
-      <w:pPr>
-        <w:spacing w:line="278" w:lineRule="auto"/>
-        <w:jc w:val="left"/>
-        <w:rPr>
-          <w:sz w:val="20"/>
-          <w:szCs w:val="20"/>
-        </w:rPr>
-      </w:pPr>
-    </w:p>
-    <w:p>
-      <w:pPr>
-        <w:spacing w:line="278" w:lineRule="auto"/>
-        <w:jc w:val="left"/>
-      </w:pPr>
-      <w:r>
-        <w:t>3.2.3 Sequence Diagram</w:t>
-      </w:r>
-      <w:r>
-        <w:t xml:space="preserve"> (User purchase)</w:t>
-      </w:r>
-    </w:p>
-    <w:p>
-      <w:pPr>
-        <w:spacing w:line="278" w:lineRule="auto"/>
-        <w:jc w:val="left"/>
       </w:pPr>
       <w:r>
         <w:rPr>
           <w:noProof/>
         </w:rPr>
         <w:drawing>
-          <wp:inline distT="0" distB="0" distL="0" distR="0" wp14:anchorId="25883732" wp14:editId="2913A589">
+          <wp:inline distT="0" distB="0" distL="0" distR="0" wp14:anchorId="25883732" wp14:editId="2F363C9F">
             <wp:extent cx="4754880" cy="5602731"/>
             <wp:effectExtent l="0" t="0" r="7620" b="0"/>
             <wp:docPr id="612221039" name="Picture 6"/>
@@ -3575,15 +3060,7 @@
         <w:t>TypeScript:</w:t>
       </w:r>
       <w:r>
-        <w:t xml:space="preserve"> </w:t>
-      </w:r>
-      <w:proofErr w:type="gramStart"/>
-      <w:r>
-        <w:t>Strongly-typed</w:t>
-      </w:r>
-      <w:proofErr w:type="gramEnd"/>
-      <w:r>
-        <w:t xml:space="preserve"> JavaScript for safer development</w:t>
+        <w:t xml:space="preserve"> Strongly-typed JavaScript for safer development</w:t>
       </w:r>
     </w:p>
     <w:p>
@@ -4440,27 +3917,13 @@
               <w:rPr>
                 <w:rFonts w:asciiTheme="majorBidi" w:hAnsiTheme="majorBidi" w:cstheme="majorBidi"/>
               </w:rPr>
-              <w:t xml:space="preserve">Design </w:t>
-            </w:r>
-            <w:proofErr w:type="gramStart"/>
+              <w:t xml:space="preserve">Design a </w:t>
+            </w:r>
             <w:r>
               <w:rPr>
                 <w:rFonts w:asciiTheme="majorBidi" w:hAnsiTheme="majorBidi" w:cstheme="majorBidi"/>
               </w:rPr>
-              <w:t xml:space="preserve">a </w:t>
-            </w:r>
-            <w:r>
-              <w:rPr>
-                <w:rFonts w:asciiTheme="majorBidi" w:hAnsiTheme="majorBidi" w:cstheme="majorBidi"/>
-              </w:rPr>
-              <w:t>use</w:t>
-            </w:r>
-            <w:proofErr w:type="gramEnd"/>
-            <w:r>
-              <w:rPr>
-                <w:rFonts w:asciiTheme="majorBidi" w:hAnsiTheme="majorBidi" w:cstheme="majorBidi"/>
-              </w:rPr>
-              <w:t xml:space="preserve"> </w:t>
+              <w:t xml:space="preserve">use </w:t>
             </w:r>
             <w:r>
               <w:rPr>
@@ -5280,27 +4743,10 @@
           <w:b/>
           <w:bCs/>
         </w:rPr>
-        <w:t xml:space="preserve">ASP.NET Core </w:t>
-      </w:r>
-      <w:proofErr w:type="spellStart"/>
-      <w:r>
-        <w:rPr>
-          <w:b/>
-          <w:bCs/>
-        </w:rPr>
-        <w:t>SignalR</w:t>
-      </w:r>
-      <w:proofErr w:type="spellEnd"/>
-      <w:r>
-        <w:t xml:space="preserve"> is used for real-time push notifications to </w:t>
-      </w:r>
-      <w:proofErr w:type="gramStart"/>
-      <w:r>
-        <w:t>connected</w:t>
-      </w:r>
-      <w:proofErr w:type="gramEnd"/>
-      <w:r>
-        <w:t xml:space="preserve"> clients.</w:t>
+        <w:t>ASP.NET Core SignalR</w:t>
+      </w:r>
+      <w:r>
+        <w:t> is used for real-time push notifications to connected clients.</w:t>
       </w:r>
     </w:p>
     <w:tbl>
@@ -5407,8 +4853,6 @@
                 <w:szCs w:val="22"/>
               </w:rPr>
             </w:pPr>
-            <w:proofErr w:type="spellStart"/>
-            <w:proofErr w:type="gramStart"/>
             <w:r>
               <w:rPr>
                 <w:sz w:val="22"/>
@@ -5416,8 +4860,6 @@
               </w:rPr>
               <w:t>Microsoft.EntityFrameworkCore.SqlServer</w:t>
             </w:r>
-            <w:proofErr w:type="spellEnd"/>
-            <w:proofErr w:type="gramEnd"/>
           </w:p>
         </w:tc>
         <w:tc>
@@ -5483,8 +4925,6 @@
                 <w:szCs w:val="22"/>
               </w:rPr>
             </w:pPr>
-            <w:proofErr w:type="spellStart"/>
-            <w:proofErr w:type="gramStart"/>
             <w:r>
               <w:rPr>
                 <w:sz w:val="22"/>
@@ -5492,8 +4932,6 @@
               </w:rPr>
               <w:t>Microsoft.AspNetCore.Authentication.JwtBearer</w:t>
             </w:r>
-            <w:proofErr w:type="spellEnd"/>
-            <w:proofErr w:type="gramEnd"/>
           </w:p>
         </w:tc>
         <w:tc>
@@ -5562,8 +5000,6 @@
                 <w:szCs w:val="22"/>
               </w:rPr>
             </w:pPr>
-            <w:proofErr w:type="spellStart"/>
-            <w:proofErr w:type="gramStart"/>
             <w:r>
               <w:rPr>
                 <w:sz w:val="22"/>
@@ -5571,8 +5007,6 @@
               </w:rPr>
               <w:t>Microsoft.AspNetCore.SignalR</w:t>
             </w:r>
-            <w:proofErr w:type="spellEnd"/>
-            <w:proofErr w:type="gramEnd"/>
           </w:p>
         </w:tc>
         <w:tc>
@@ -5638,7 +5072,6 @@
                 <w:szCs w:val="22"/>
               </w:rPr>
             </w:pPr>
-            <w:proofErr w:type="spellStart"/>
             <w:r>
               <w:rPr>
                 <w:sz w:val="22"/>
@@ -5646,7 +5079,6 @@
               </w:rPr>
               <w:t>Mapster</w:t>
             </w:r>
-            <w:proofErr w:type="spellEnd"/>
           </w:p>
         </w:tc>
         <w:tc>
@@ -5715,7 +5147,6 @@
                 <w:szCs w:val="22"/>
               </w:rPr>
             </w:pPr>
-            <w:proofErr w:type="spellStart"/>
             <w:r>
               <w:rPr>
                 <w:sz w:val="22"/>
@@ -5723,7 +5154,6 @@
               </w:rPr>
               <w:t>FluentValidation.AspNetCore</w:t>
             </w:r>
-            <w:proofErr w:type="spellEnd"/>
           </w:p>
         </w:tc>
         <w:tc>
@@ -5788,31 +5218,13 @@
                 <w:szCs w:val="22"/>
               </w:rPr>
             </w:pPr>
-            <w:proofErr w:type="spellStart"/>
             <w:r>
               <w:rPr>
                 <w:sz w:val="22"/>
                 <w:szCs w:val="22"/>
               </w:rPr>
-              <w:t>MailKit</w:t>
-            </w:r>
-            <w:proofErr w:type="spellEnd"/>
-            <w:r>
-              <w:rPr>
-                <w:sz w:val="22"/>
-                <w:szCs w:val="22"/>
-              </w:rPr>
-              <w:t xml:space="preserve"> / </w:t>
-            </w:r>
-            <w:proofErr w:type="spellStart"/>
-            <w:r>
-              <w:rPr>
-                <w:sz w:val="22"/>
-                <w:szCs w:val="22"/>
-              </w:rPr>
-              <w:t>FluentEmail.Smtp</w:t>
-            </w:r>
-            <w:proofErr w:type="spellEnd"/>
+              <w:t>MailKit / FluentEmail.Smtp</w:t>
+            </w:r>
           </w:p>
         </w:tc>
         <w:tc>
@@ -5899,7 +5311,6 @@
       <w:r>
         <w:t> application built with </w:t>
       </w:r>
-      <w:proofErr w:type="spellStart"/>
       <w:r>
         <w:rPr>
           <w:b/>
@@ -5907,11 +5318,9 @@
         </w:rPr>
         <w:t>FastAPI</w:t>
       </w:r>
-      <w:proofErr w:type="spellEnd"/>
       <w:r>
         <w:t> and served via </w:t>
       </w:r>
-      <w:proofErr w:type="spellStart"/>
       <w:r>
         <w:rPr>
           <w:b/>
@@ -5919,7 +5328,6 @@
         </w:rPr>
         <w:t>Uvicorn</w:t>
       </w:r>
-      <w:proofErr w:type="spellEnd"/>
       <w:r>
         <w:t>. It runs separately from the main backend and is deployed as a Docker container. Model inference uses </w:t>
       </w:r>
@@ -5931,35 +5339,18 @@
         <w:t>ONNX Runtime</w:t>
       </w:r>
       <w:r>
-        <w:t> (CPU mode), which allows the trained TensorFlow/</w:t>
-      </w:r>
-      <w:proofErr w:type="spellStart"/>
-      <w:r>
-        <w:t>Keras</w:t>
-      </w:r>
-      <w:proofErr w:type="spellEnd"/>
-      <w:r>
-        <w:t xml:space="preserve"> models to run </w:t>
+        <w:t xml:space="preserve"> (CPU mode), which allows the trained TensorFlow/Keras models to run </w:t>
       </w:r>
       <w:r>
         <w:lastRenderedPageBreak/>
         <w:t>without any GPU dependency. The sentiment analysis component uses a pre-trained multilingual transformer from </w:t>
       </w:r>
-      <w:proofErr w:type="spellStart"/>
       <w:r>
         <w:rPr>
           <w:b/>
           <w:bCs/>
         </w:rPr>
-        <w:t>HuggingFace</w:t>
-      </w:r>
-      <w:proofErr w:type="spellEnd"/>
-      <w:r>
-        <w:rPr>
-          <w:b/>
-          <w:bCs/>
-        </w:rPr>
-        <w:t xml:space="preserve"> Transformers</w:t>
+        <w:t>HuggingFace Transformers</w:t>
       </w:r>
       <w:r>
         <w:t>.</w:t>
@@ -6045,7 +5436,6 @@
                 <w:szCs w:val="22"/>
               </w:rPr>
             </w:pPr>
-            <w:proofErr w:type="spellStart"/>
             <w:r>
               <w:rPr>
                 <w:sz w:val="22"/>
@@ -6053,7 +5443,6 @@
               </w:rPr>
               <w:t>FastAPI</w:t>
             </w:r>
-            <w:proofErr w:type="spellEnd"/>
           </w:p>
         </w:tc>
         <w:tc>
@@ -6199,23 +5588,7 @@
                 <w:sz w:val="22"/>
                 <w:szCs w:val="22"/>
               </w:rPr>
-              <w:t>Transformers (</w:t>
-            </w:r>
-            <w:proofErr w:type="spellStart"/>
-            <w:r>
-              <w:rPr>
-                <w:sz w:val="22"/>
-                <w:szCs w:val="22"/>
-              </w:rPr>
-              <w:t>HuggingFace</w:t>
-            </w:r>
-            <w:proofErr w:type="spellEnd"/>
-            <w:r>
-              <w:rPr>
-                <w:sz w:val="22"/>
-                <w:szCs w:val="22"/>
-              </w:rPr>
-              <w:t>)</w:t>
+              <w:t>Transformers (HuggingFace)</w:t>
             </w:r>
           </w:p>
         </w:tc>
@@ -6266,67 +5639,56 @@
                 <w:sz w:val="22"/>
                 <w:szCs w:val="22"/>
               </w:rPr>
-              <w:t xml:space="preserve">TensorFlow / </w:t>
-            </w:r>
-            <w:proofErr w:type="spellStart"/>
-            <w:r>
+              <w:t>TensorFlow / Keras</w:t>
+            </w:r>
+          </w:p>
+        </w:tc>
+        <w:tc>
+          <w:tcPr>
+            <w:tcW w:w="5220" w:type="dxa"/>
+            <w:hideMark/>
+          </w:tcPr>
+          <w:p>
+            <w:pPr>
+              <w:spacing w:after="160"/>
+              <w:cnfStyle w:val="000000100000" w:firstRow="0" w:lastRow="0" w:firstColumn="0" w:lastColumn="0" w:oddVBand="0" w:evenVBand="0" w:oddHBand="1" w:evenHBand="0" w:firstRowFirstColumn="0" w:firstRowLastColumn="0" w:lastRowFirstColumn="0" w:lastRowLastColumn="0"/>
               <w:rPr>
                 <w:sz w:val="22"/>
                 <w:szCs w:val="22"/>
               </w:rPr>
-              <w:t>Keras</w:t>
-            </w:r>
-            <w:proofErr w:type="spellEnd"/>
-          </w:p>
-        </w:tc>
-        <w:tc>
-          <w:tcPr>
-            <w:tcW w:w="5220" w:type="dxa"/>
-            <w:hideMark/>
-          </w:tcPr>
-          <w:p>
-            <w:pPr>
-              <w:spacing w:after="160"/>
-              <w:cnfStyle w:val="000000100000" w:firstRow="0" w:lastRow="0" w:firstColumn="0" w:lastColumn="0" w:oddVBand="0" w:evenVBand="0" w:oddHBand="1" w:evenHBand="0" w:firstRowFirstColumn="0" w:firstRowLastColumn="0" w:lastRowFirstColumn="0" w:lastRowLastColumn="0"/>
+            </w:pPr>
+            <w:r>
               <w:rPr>
                 <w:sz w:val="22"/>
                 <w:szCs w:val="22"/>
               </w:rPr>
-            </w:pPr>
-            <w:r>
+              <w:t>Model training (offline pipeline)</w:t>
+            </w:r>
+          </w:p>
+        </w:tc>
+      </w:tr>
+      <w:tr>
+        <w:tc>
+          <w:tcPr>
+            <w:cnfStyle w:val="001000000000" w:firstRow="0" w:lastRow="0" w:firstColumn="1" w:lastColumn="0" w:oddVBand="0" w:evenVBand="0" w:oddHBand="0" w:evenHBand="0" w:firstRowFirstColumn="0" w:firstRowLastColumn="0" w:lastRowFirstColumn="0" w:lastRowLastColumn="0"/>
+            <w:tcW w:w="4140" w:type="dxa"/>
+            <w:hideMark/>
+          </w:tcPr>
+          <w:p>
+            <w:pPr>
+              <w:spacing w:after="160"/>
               <w:rPr>
                 <w:sz w:val="22"/>
                 <w:szCs w:val="22"/>
               </w:rPr>
-              <w:t>Model training (offline pipeline)</w:t>
-            </w:r>
-          </w:p>
-        </w:tc>
-      </w:tr>
-      <w:tr>
-        <w:tc>
-          <w:tcPr>
-            <w:cnfStyle w:val="001000000000" w:firstRow="0" w:lastRow="0" w:firstColumn="1" w:lastColumn="0" w:oddVBand="0" w:evenVBand="0" w:oddHBand="0" w:evenHBand="0" w:firstRowFirstColumn="0" w:firstRowLastColumn="0" w:lastRowFirstColumn="0" w:lastRowLastColumn="0"/>
-            <w:tcW w:w="4140" w:type="dxa"/>
-            <w:hideMark/>
-          </w:tcPr>
-          <w:p>
-            <w:pPr>
-              <w:spacing w:after="160"/>
+            </w:pPr>
+            <w:r>
               <w:rPr>
                 <w:sz w:val="22"/>
                 <w:szCs w:val="22"/>
               </w:rPr>
-            </w:pPr>
-            <w:proofErr w:type="spellStart"/>
-            <w:r>
-              <w:rPr>
-                <w:sz w:val="22"/>
-                <w:szCs w:val="22"/>
-              </w:rPr>
               <w:t>Uvicorn</w:t>
             </w:r>
-            <w:proofErr w:type="spellEnd"/>
           </w:p>
         </w:tc>
         <w:tc>
@@ -6434,32 +5796,15 @@
       <w:r>
         <w:t> handles styling. </w:t>
       </w:r>
-      <w:proofErr w:type="spellStart"/>
       <w:r>
         <w:rPr>
           <w:b/>
           <w:bCs/>
         </w:rPr>
-        <w:t>TanStack</w:t>
-      </w:r>
-      <w:proofErr w:type="spellEnd"/>
-      <w:r>
-        <w:rPr>
-          <w:b/>
-          <w:bCs/>
-        </w:rPr>
-        <w:t xml:space="preserve"> Query</w:t>
-      </w:r>
-      <w:r>
-        <w:t xml:space="preserve"> manages server state and automatic </w:t>
-      </w:r>
-      <w:proofErr w:type="spellStart"/>
-      <w:r>
-        <w:t>refetching</w:t>
-      </w:r>
-      <w:proofErr w:type="spellEnd"/>
-      <w:r>
-        <w:t>, while </w:t>
+        <w:t>TanStack Query</w:t>
+      </w:r>
+      <w:r>
+        <w:t> manages server state and automatic refetching, while </w:t>
       </w:r>
       <w:r>
         <w:rPr>
@@ -6718,21 +6063,12 @@
                 <w:szCs w:val="22"/>
               </w:rPr>
             </w:pPr>
-            <w:proofErr w:type="spellStart"/>
             <w:r>
               <w:rPr>
                 <w:sz w:val="22"/>
                 <w:szCs w:val="22"/>
               </w:rPr>
-              <w:t>TanStack</w:t>
-            </w:r>
-            <w:proofErr w:type="spellEnd"/>
-            <w:r>
-              <w:rPr>
-                <w:sz w:val="22"/>
-                <w:szCs w:val="22"/>
-              </w:rPr>
-              <w:t xml:space="preserve"> Query (React Query)</w:t>
+              <w:t>TanStack Query (React Query)</w:t>
             </w:r>
           </w:p>
         </w:tc>
@@ -6901,65 +6237,38 @@
                 <w:szCs w:val="22"/>
               </w:rPr>
             </w:pPr>
-            <w:proofErr w:type="gramStart"/>
             <w:r>
               <w:rPr>
                 <w:sz w:val="22"/>
                 <w:szCs w:val="22"/>
               </w:rPr>
-              <w:t>Form</w:t>
-            </w:r>
-            <w:proofErr w:type="gramEnd"/>
-            <w:r>
+              <w:t>Form handling and validation</w:t>
+            </w:r>
+          </w:p>
+        </w:tc>
+      </w:tr>
+      <w:tr>
+        <w:tc>
+          <w:tcPr>
+            <w:cnfStyle w:val="001000000000" w:firstRow="0" w:lastRow="0" w:firstColumn="1" w:lastColumn="0" w:oddVBand="0" w:evenVBand="0" w:oddHBand="0" w:evenHBand="0" w:firstRowFirstColumn="0" w:firstRowLastColumn="0" w:lastRowFirstColumn="0" w:lastRowLastColumn="0"/>
+            <w:tcW w:w="4500" w:type="dxa"/>
+            <w:hideMark/>
+          </w:tcPr>
+          <w:p>
+            <w:pPr>
+              <w:spacing w:after="160"/>
               <w:rPr>
                 <w:sz w:val="22"/>
                 <w:szCs w:val="22"/>
               </w:rPr>
-              <w:t xml:space="preserve"> handling and validation</w:t>
-            </w:r>
-          </w:p>
-        </w:tc>
-      </w:tr>
-      <w:tr>
-        <w:tc>
-          <w:tcPr>
-            <w:cnfStyle w:val="001000000000" w:firstRow="0" w:lastRow="0" w:firstColumn="1" w:lastColumn="0" w:oddVBand="0" w:evenVBand="0" w:oddHBand="0" w:evenHBand="0" w:firstRowFirstColumn="0" w:firstRowLastColumn="0" w:lastRowFirstColumn="0" w:lastRowLastColumn="0"/>
-            <w:tcW w:w="4500" w:type="dxa"/>
-            <w:hideMark/>
-          </w:tcPr>
-          <w:p>
-            <w:pPr>
-              <w:spacing w:after="160"/>
+            </w:pPr>
+            <w:r>
               <w:rPr>
                 <w:sz w:val="22"/>
                 <w:szCs w:val="22"/>
               </w:rPr>
-            </w:pPr>
-            <w:proofErr w:type="spellStart"/>
-            <w:r>
-              <w:rPr>
-                <w:sz w:val="22"/>
-                <w:szCs w:val="22"/>
-              </w:rPr>
-              <w:t>jsPDF</w:t>
-            </w:r>
-            <w:proofErr w:type="spellEnd"/>
-            <w:r>
-              <w:rPr>
-                <w:sz w:val="22"/>
-                <w:szCs w:val="22"/>
-              </w:rPr>
-              <w:t xml:space="preserve"> + </w:t>
-            </w:r>
-            <w:proofErr w:type="spellStart"/>
-            <w:r>
-              <w:rPr>
-                <w:sz w:val="22"/>
-                <w:szCs w:val="22"/>
-              </w:rPr>
-              <w:t>jspdf-autotable</w:t>
-            </w:r>
-            <w:proofErr w:type="spellEnd"/>
+              <w:t>jsPDF + jspdf-autotable</w:t>
+            </w:r>
           </w:p>
         </w:tc>
         <w:tc>
@@ -7024,56 +6333,15 @@
       <w:r>
         <w:t> (Dart), targeting Android and iOS from a single codebase. State management follows the </w:t>
       </w:r>
-      <w:proofErr w:type="spellStart"/>
       <w:r>
         <w:rPr>
           <w:b/>
           <w:bCs/>
         </w:rPr>
-        <w:t>BLoC</w:t>
-      </w:r>
-      <w:proofErr w:type="spellEnd"/>
-      <w:r>
-        <w:rPr>
-          <w:b/>
-          <w:bCs/>
-        </w:rPr>
-        <w:t xml:space="preserve"> pattern</w:t>
-      </w:r>
-      <w:r>
-        <w:t> using </w:t>
-      </w:r>
-      <w:proofErr w:type="spellStart"/>
-      <w:r>
-        <w:t>flutter_bloc</w:t>
-      </w:r>
-      <w:proofErr w:type="spellEnd"/>
-      <w:r>
-        <w:t>. Navigation is handled declaratively with </w:t>
-      </w:r>
-      <w:proofErr w:type="spellStart"/>
-      <w:r>
-        <w:t>go_router</w:t>
-      </w:r>
-      <w:proofErr w:type="spellEnd"/>
-      <w:r>
-        <w:t>. Location features use </w:t>
-      </w:r>
-      <w:proofErr w:type="spellStart"/>
-      <w:r>
-        <w:t>google_maps_flutter</w:t>
-      </w:r>
-      <w:proofErr w:type="spellEnd"/>
-      <w:r>
-        <w:t> and geolocator, while secure storage of auth tokens is handled by </w:t>
-      </w:r>
-      <w:proofErr w:type="spellStart"/>
-      <w:r>
-        <w:t>flutter_secure_storage</w:t>
-      </w:r>
-      <w:proofErr w:type="spellEnd"/>
-      <w:r>
-        <w:t>.</w:t>
+        <w:t>BLoC pattern</w:t>
+      </w:r>
+      <w:r>
+        <w:t> using flutter_bloc. Navigation is handled declaratively with go_router. Location features use google_maps_flutter and geolocator, while secure storage of auth tokens is handled by flutter_secure_storage.</w:t>
       </w:r>
     </w:p>
     <w:tbl>
@@ -7155,7 +6423,6 @@
                 <w:szCs w:val="22"/>
               </w:rPr>
             </w:pPr>
-            <w:proofErr w:type="spellStart"/>
             <w:r>
               <w:rPr>
                 <w:sz w:val="22"/>
@@ -7163,7 +6430,6 @@
               </w:rPr>
               <w:t>flutter_bloc</w:t>
             </w:r>
-            <w:proofErr w:type="spellEnd"/>
           </w:p>
         </w:tc>
         <w:tc>
@@ -7180,49 +6446,38 @@
                 <w:szCs w:val="22"/>
               </w:rPr>
             </w:pPr>
-            <w:proofErr w:type="spellStart"/>
             <w:r>
               <w:rPr>
                 <w:sz w:val="22"/>
                 <w:szCs w:val="22"/>
               </w:rPr>
-              <w:t>BLoC</w:t>
-            </w:r>
-            <w:proofErr w:type="spellEnd"/>
-            <w:r>
+              <w:t>BLoC state management</w:t>
+            </w:r>
+          </w:p>
+        </w:tc>
+      </w:tr>
+      <w:tr>
+        <w:tc>
+          <w:tcPr>
+            <w:cnfStyle w:val="001000000000" w:firstRow="0" w:lastRow="0" w:firstColumn="1" w:lastColumn="0" w:oddVBand="0" w:evenVBand="0" w:oddHBand="0" w:evenHBand="0" w:firstRowFirstColumn="0" w:firstRowLastColumn="0" w:lastRowFirstColumn="0" w:lastRowLastColumn="0"/>
+            <w:tcW w:w="3060" w:type="dxa"/>
+            <w:hideMark/>
+          </w:tcPr>
+          <w:p>
+            <w:pPr>
+              <w:spacing w:after="160"/>
               <w:rPr>
                 <w:sz w:val="22"/>
                 <w:szCs w:val="22"/>
               </w:rPr>
-              <w:t xml:space="preserve"> state management</w:t>
-            </w:r>
-          </w:p>
-        </w:tc>
-      </w:tr>
-      <w:tr>
-        <w:tc>
-          <w:tcPr>
-            <w:cnfStyle w:val="001000000000" w:firstRow="0" w:lastRow="0" w:firstColumn="1" w:lastColumn="0" w:oddVBand="0" w:evenVBand="0" w:oddHBand="0" w:evenHBand="0" w:firstRowFirstColumn="0" w:firstRowLastColumn="0" w:lastRowFirstColumn="0" w:lastRowLastColumn="0"/>
-            <w:tcW w:w="3060" w:type="dxa"/>
-            <w:hideMark/>
-          </w:tcPr>
-          <w:p>
-            <w:pPr>
-              <w:spacing w:after="160"/>
+            </w:pPr>
+            <w:r>
               <w:rPr>
                 <w:sz w:val="22"/>
                 <w:szCs w:val="22"/>
               </w:rPr>
-            </w:pPr>
-            <w:proofErr w:type="spellStart"/>
-            <w:r>
-              <w:rPr>
-                <w:sz w:val="22"/>
-                <w:szCs w:val="22"/>
-              </w:rPr>
               <w:t>dio</w:t>
             </w:r>
-            <w:proofErr w:type="spellEnd"/>
           </w:p>
         </w:tc>
         <w:tc>
@@ -7267,7 +6522,6 @@
                 <w:szCs w:val="22"/>
               </w:rPr>
             </w:pPr>
-            <w:proofErr w:type="spellStart"/>
             <w:r>
               <w:rPr>
                 <w:sz w:val="22"/>
@@ -7275,7 +6529,6 @@
               </w:rPr>
               <w:t>go_router</w:t>
             </w:r>
-            <w:proofErr w:type="spellEnd"/>
           </w:p>
         </w:tc>
         <w:tc>
@@ -7317,7 +6570,6 @@
                 <w:szCs w:val="22"/>
               </w:rPr>
             </w:pPr>
-            <w:proofErr w:type="spellStart"/>
             <w:r>
               <w:rPr>
                 <w:sz w:val="22"/>
@@ -7325,7 +6577,6 @@
               </w:rPr>
               <w:t>google_maps_flutter</w:t>
             </w:r>
-            <w:proofErr w:type="spellEnd"/>
           </w:p>
         </w:tc>
         <w:tc>
@@ -7370,7 +6621,6 @@
                 <w:szCs w:val="22"/>
               </w:rPr>
             </w:pPr>
-            <w:proofErr w:type="spellStart"/>
             <w:r>
               <w:rPr>
                 <w:sz w:val="22"/>
@@ -7378,7 +6628,6 @@
               </w:rPr>
               <w:t>flutter_secure_storage</w:t>
             </w:r>
-            <w:proofErr w:type="spellEnd"/>
           </w:p>
         </w:tc>
         <w:tc>
@@ -7420,7 +6669,6 @@
                 <w:szCs w:val="22"/>
               </w:rPr>
             </w:pPr>
-            <w:proofErr w:type="spellStart"/>
             <w:r>
               <w:rPr>
                 <w:sz w:val="22"/>
@@ -7428,7 +6676,6 @@
               </w:rPr>
               <w:t>firebase_core</w:t>
             </w:r>
-            <w:proofErr w:type="spellEnd"/>
           </w:p>
         </w:tc>
         <w:tc>
@@ -7473,7 +6720,6 @@
                 <w:szCs w:val="22"/>
               </w:rPr>
             </w:pPr>
-            <w:proofErr w:type="spellStart"/>
             <w:r>
               <w:rPr>
                 <w:sz w:val="22"/>
@@ -7481,7 +6727,6 @@
               </w:rPr>
               <w:t>cached_network_image</w:t>
             </w:r>
-            <w:proofErr w:type="spellEnd"/>
           </w:p>
         </w:tc>
         <w:tc>
@@ -7523,7 +6768,6 @@
                 <w:szCs w:val="22"/>
               </w:rPr>
             </w:pPr>
-            <w:proofErr w:type="spellStart"/>
             <w:r>
               <w:rPr>
                 <w:sz w:val="22"/>
@@ -7531,7 +6775,6 @@
               </w:rPr>
               <w:t>flutter_localizations</w:t>
             </w:r>
-            <w:proofErr w:type="spellEnd"/>
           </w:p>
         </w:tc>
         <w:tc>
@@ -7808,11 +7051,9 @@
             <w:pPr>
               <w:spacing w:after="160"/>
             </w:pPr>
-            <w:proofErr w:type="spellStart"/>
             <w:r>
               <w:t>Vercel</w:t>
             </w:r>
-            <w:proofErr w:type="spellEnd"/>
           </w:p>
         </w:tc>
         <w:tc>
@@ -7847,15 +7088,7 @@
         <w:jc w:val="left"/>
       </w:pPr>
       <w:r>
-        <w:t xml:space="preserve">The Waste2Taste platform is structured as a distributed network of modular systems. The architecture consists of a client-side layer (the customer-facing mobile application and the administrator web panel) and a server-side layer (the transactional ASP.NET backend and the Python </w:t>
-      </w:r>
-      <w:proofErr w:type="spellStart"/>
-      <w:r>
-        <w:t>FastAPI</w:t>
-      </w:r>
-      <w:proofErr w:type="spellEnd"/>
-      <w:r>
-        <w:t xml:space="preserve"> AI microservice).</w:t>
+        <w:t>The Waste2Taste platform is structured as a distributed network of modular systems. The architecture consists of a client-side layer (the customer-facing mobile application and the administrator web panel) and a server-side layer (the transactional ASP.NET backend and the Python FastAPI AI microservice).</w:t>
       </w:r>
     </w:p>
     <w:p>
@@ -7926,15 +7159,7 @@
         <w:jc w:val="left"/>
       </w:pPr>
       <w:r>
-        <w:t xml:space="preserve">The backend </w:t>
-      </w:r>
-      <w:proofErr w:type="spellStart"/>
-      <w:r>
-        <w:t>backend</w:t>
-      </w:r>
-      <w:proofErr w:type="spellEnd"/>
-      <w:r>
-        <w:t xml:space="preserve"> API is designed using a </w:t>
+        <w:t>The backend backend API is designed using a </w:t>
       </w:r>
       <w:r>
         <w:rPr>
@@ -7964,15 +7189,7 @@
         <w:t>Presentation Layer (FoodRescue.PL)</w:t>
       </w:r>
       <w:r>
-        <w:t xml:space="preserve">: Defines REST controllers, route handlers, error filters, and </w:t>
-      </w:r>
-      <w:proofErr w:type="spellStart"/>
-      <w:r>
-        <w:t>SignalR</w:t>
-      </w:r>
-      <w:proofErr w:type="spellEnd"/>
-      <w:r>
-        <w:t xml:space="preserve"> presence hubs.</w:t>
+        <w:t>: Defines REST controllers, route handlers, error filters, and SignalR presence hubs.</w:t>
       </w:r>
     </w:p>
     <w:p>
@@ -7989,34 +7206,10 @@
           <w:b/>
           <w:bCs/>
         </w:rPr>
-        <w:t>Business Logic Layer (</w:t>
-      </w:r>
-      <w:proofErr w:type="spellStart"/>
-      <w:r>
-        <w:rPr>
-          <w:b/>
-          <w:bCs/>
-        </w:rPr>
-        <w:t>FoodRescue.BLL</w:t>
-      </w:r>
-      <w:proofErr w:type="spellEnd"/>
-      <w:r>
-        <w:rPr>
-          <w:b/>
-          <w:bCs/>
-        </w:rPr>
-        <w:t>)</w:t>
-      </w:r>
-      <w:r>
-        <w:t xml:space="preserve">: Houses business rules, logic services, custom data validation via </w:t>
-      </w:r>
-      <w:proofErr w:type="spellStart"/>
-      <w:r>
-        <w:t>FluentValidation</w:t>
-      </w:r>
-      <w:proofErr w:type="spellEnd"/>
-      <w:r>
-        <w:t>, and objects/DTO mappers.</w:t>
+        <w:t>Business Logic Layer (FoodRescue.BLL)</w:t>
+      </w:r>
+      <w:r>
+        <w:t>: Houses business rules, logic services, custom data validation via FluentValidation, and objects/DTO mappers.</w:t>
       </w:r>
     </w:p>
     <w:p>
@@ -8033,34 +7226,10 @@
           <w:b/>
           <w:bCs/>
         </w:rPr>
-        <w:t>Data Access Layer (</w:t>
-      </w:r>
-      <w:proofErr w:type="spellStart"/>
-      <w:r>
-        <w:rPr>
-          <w:b/>
-          <w:bCs/>
-        </w:rPr>
-        <w:t>FoodRescue.DAL</w:t>
-      </w:r>
-      <w:proofErr w:type="spellEnd"/>
-      <w:r>
-        <w:rPr>
-          <w:b/>
-          <w:bCs/>
-        </w:rPr>
-        <w:t>)</w:t>
-      </w:r>
-      <w:r>
-        <w:t>: Governs the EF Core </w:t>
-      </w:r>
-      <w:proofErr w:type="spellStart"/>
-      <w:r>
-        <w:t>CompanyDbContext</w:t>
-      </w:r>
-      <w:proofErr w:type="spellEnd"/>
-      <w:r>
-        <w:t>, database entity models, and schema configurations.</w:t>
+        <w:t>Data Access Layer (FoodRescue.DAL)</w:t>
+      </w:r>
+      <w:r>
+        <w:t>: Governs the EF Core CompanyDbContext, database entity models, and schema configurations.</w:t>
       </w:r>
     </w:p>
     <w:p>
@@ -8177,11 +7346,9 @@
               <w:spacing w:line="278" w:lineRule="auto"/>
               <w:jc w:val="left"/>
             </w:pPr>
-            <w:proofErr w:type="spellStart"/>
             <w:r>
               <w:t>AuthController</w:t>
             </w:r>
-            <w:proofErr w:type="spellEnd"/>
           </w:p>
         </w:tc>
         <w:tc>
@@ -8211,27 +7378,9 @@
               <w:jc w:val="left"/>
               <w:cnfStyle w:val="000000000000" w:firstRow="0" w:lastRow="0" w:firstColumn="0" w:lastColumn="0" w:oddVBand="0" w:evenVBand="0" w:oddHBand="0" w:evenHBand="0" w:firstRowFirstColumn="0" w:firstRowLastColumn="0" w:lastRowFirstColumn="0" w:lastRowLastColumn="0"/>
             </w:pPr>
-            <w:proofErr w:type="spellStart"/>
-            <w:r>
-              <w:t>AuthService</w:t>
-            </w:r>
-            <w:proofErr w:type="spellEnd"/>
-            <w:r>
-              <w:t>, </w:t>
-            </w:r>
-            <w:proofErr w:type="spellStart"/>
-            <w:r>
-              <w:t>RegisterDto</w:t>
-            </w:r>
-            <w:proofErr w:type="spellEnd"/>
-            <w:r>
-              <w:t>, </w:t>
-            </w:r>
-            <w:proofErr w:type="spellStart"/>
-            <w:r>
-              <w:t>LoginDto</w:t>
-            </w:r>
-            <w:proofErr w:type="spellEnd"/>
+            <w:r>
+              <w:t>AuthService, RegisterDto, LoginDto</w:t>
+            </w:r>
           </w:p>
         </w:tc>
         <w:tc>
@@ -8246,13 +7395,8 @@
               <w:cnfStyle w:val="000000000000" w:firstRow="0" w:lastRow="0" w:firstColumn="0" w:lastColumn="0" w:oddVBand="0" w:evenVBand="0" w:oddHBand="0" w:evenHBand="0" w:firstRowFirstColumn="0" w:firstRowLastColumn="0" w:lastRowFirstColumn="0" w:lastRowLastColumn="0"/>
             </w:pPr>
             <w:r>
-              <w:t>User, </w:t>
-            </w:r>
-            <w:proofErr w:type="spellStart"/>
-            <w:r>
-              <w:t>RefreshToken</w:t>
-            </w:r>
-            <w:proofErr w:type="spellEnd"/>
+              <w:t>User, RefreshToken</w:t>
+            </w:r>
           </w:p>
         </w:tc>
       </w:tr>
@@ -8268,11 +7412,9 @@
               <w:spacing w:line="278" w:lineRule="auto"/>
               <w:jc w:val="left"/>
             </w:pPr>
-            <w:proofErr w:type="spellStart"/>
             <w:r>
               <w:t>UserController</w:t>
             </w:r>
-            <w:proofErr w:type="spellEnd"/>
           </w:p>
         </w:tc>
         <w:tc>
@@ -8302,21 +7444,9 @@
               <w:jc w:val="left"/>
               <w:cnfStyle w:val="000000000000" w:firstRow="0" w:lastRow="0" w:firstColumn="0" w:lastColumn="0" w:oddVBand="0" w:evenVBand="0" w:oddHBand="0" w:evenHBand="0" w:firstRowFirstColumn="0" w:firstRowLastColumn="0" w:lastRowFirstColumn="0" w:lastRowLastColumn="0"/>
             </w:pPr>
-            <w:proofErr w:type="spellStart"/>
-            <w:proofErr w:type="gramStart"/>
-            <w:r>
-              <w:t>UserService</w:t>
-            </w:r>
-            <w:proofErr w:type="spellEnd"/>
-            <w:proofErr w:type="gramEnd"/>
-            <w:r>
-              <w:t>, </w:t>
-            </w:r>
-            <w:proofErr w:type="spellStart"/>
-            <w:r>
-              <w:t>UserUpdateDto</w:t>
-            </w:r>
-            <w:proofErr w:type="spellEnd"/>
+            <w:r>
+              <w:t>UserService, UserUpdateDto</w:t>
+            </w:r>
           </w:p>
         </w:tc>
         <w:tc>
@@ -8380,19 +7510,9 @@
               <w:jc w:val="left"/>
               <w:cnfStyle w:val="000000000000" w:firstRow="0" w:lastRow="0" w:firstColumn="0" w:lastColumn="0" w:oddVBand="0" w:evenVBand="0" w:oddHBand="0" w:evenHBand="0" w:firstRowFirstColumn="0" w:firstRowLastColumn="0" w:lastRowFirstColumn="0" w:lastRowLastColumn="0"/>
             </w:pPr>
-            <w:proofErr w:type="spellStart"/>
-            <w:r>
-              <w:t>VendorService</w:t>
-            </w:r>
-            <w:proofErr w:type="spellEnd"/>
-            <w:r>
-              <w:t>, </w:t>
-            </w:r>
-            <w:proofErr w:type="spellStart"/>
-            <w:r>
-              <w:t>VendorProfileDto</w:t>
-            </w:r>
-            <w:proofErr w:type="spellEnd"/>
+            <w:r>
+              <w:t>VendorService, VendorProfileDto</w:t>
+            </w:r>
           </w:p>
         </w:tc>
         <w:tc>
@@ -8424,11 +7544,9 @@
               <w:spacing w:line="278" w:lineRule="auto"/>
               <w:jc w:val="left"/>
             </w:pPr>
-            <w:proofErr w:type="spellStart"/>
             <w:r>
               <w:t>VendorRequests</w:t>
             </w:r>
-            <w:proofErr w:type="spellEnd"/>
           </w:p>
         </w:tc>
         <w:tc>
@@ -8458,11 +7576,9 @@
               <w:jc w:val="left"/>
               <w:cnfStyle w:val="000000000000" w:firstRow="0" w:lastRow="0" w:firstColumn="0" w:lastColumn="0" w:oddVBand="0" w:evenVBand="0" w:oddHBand="0" w:evenHBand="0" w:firstRowFirstColumn="0" w:firstRowLastColumn="0" w:lastRowFirstColumn="0" w:lastRowLastColumn="0"/>
             </w:pPr>
-            <w:proofErr w:type="spellStart"/>
             <w:r>
               <w:t>VendorRequestService</w:t>
             </w:r>
-            <w:proofErr w:type="spellEnd"/>
           </w:p>
         </w:tc>
         <w:tc>
@@ -8476,11 +7592,9 @@
               <w:jc w:val="left"/>
               <w:cnfStyle w:val="000000000000" w:firstRow="0" w:lastRow="0" w:firstColumn="0" w:lastColumn="0" w:oddVBand="0" w:evenVBand="0" w:oddHBand="0" w:evenHBand="0" w:firstRowFirstColumn="0" w:firstRowLastColumn="0" w:lastRowFirstColumn="0" w:lastRowLastColumn="0"/>
             </w:pPr>
-            <w:proofErr w:type="spellStart"/>
             <w:r>
               <w:t>VendorRequest</w:t>
             </w:r>
-            <w:proofErr w:type="spellEnd"/>
           </w:p>
         </w:tc>
       </w:tr>
@@ -8512,13 +7626,8 @@
               <w:jc w:val="left"/>
               <w:cnfStyle w:val="000000000000" w:firstRow="0" w:lastRow="0" w:firstColumn="0" w:lastColumn="0" w:oddVBand="0" w:evenVBand="0" w:oddHBand="0" w:evenHBand="0" w:firstRowFirstColumn="0" w:firstRowLastColumn="0" w:lastRowFirstColumn="0" w:lastRowLastColumn="0"/>
             </w:pPr>
-            <w:proofErr w:type="gramStart"/>
-            <w:r>
-              <w:t>Allows</w:t>
-            </w:r>
-            <w:proofErr w:type="gramEnd"/>
-            <w:r>
-              <w:t xml:space="preserve"> adding, editing, listing, and filtering foods.</w:t>
+            <w:r>
+              <w:t>Allows adding, editing, listing, and filtering foods.</w:t>
             </w:r>
           </w:p>
         </w:tc>
@@ -8533,21 +7642,9 @@
               <w:jc w:val="left"/>
               <w:cnfStyle w:val="000000000000" w:firstRow="0" w:lastRow="0" w:firstColumn="0" w:lastColumn="0" w:oddVBand="0" w:evenVBand="0" w:oddHBand="0" w:evenHBand="0" w:firstRowFirstColumn="0" w:firstRowLastColumn="0" w:lastRowFirstColumn="0" w:lastRowLastColumn="0"/>
             </w:pPr>
-            <w:proofErr w:type="spellStart"/>
-            <w:proofErr w:type="gramStart"/>
-            <w:r>
-              <w:t>ProductService</w:t>
-            </w:r>
-            <w:proofErr w:type="spellEnd"/>
-            <w:proofErr w:type="gramEnd"/>
-            <w:r>
-              <w:t>, </w:t>
-            </w:r>
-            <w:proofErr w:type="spellStart"/>
-            <w:r>
-              <w:t>ProductCreateDto</w:t>
-            </w:r>
-            <w:proofErr w:type="spellEnd"/>
+            <w:r>
+              <w:t>ProductService, ProductCreateDto</w:t>
+            </w:r>
           </w:p>
         </w:tc>
         <w:tc>
@@ -8611,11 +7708,9 @@
               <w:jc w:val="left"/>
               <w:cnfStyle w:val="000000000000" w:firstRow="0" w:lastRow="0" w:firstColumn="0" w:lastColumn="0" w:oddVBand="0" w:evenVBand="0" w:oddHBand="0" w:evenHBand="0" w:firstRowFirstColumn="0" w:firstRowLastColumn="0" w:lastRowFirstColumn="0" w:lastRowLastColumn="0"/>
             </w:pPr>
-            <w:proofErr w:type="spellStart"/>
             <w:r>
               <w:t>FileStorageService</w:t>
             </w:r>
-            <w:proofErr w:type="spellEnd"/>
           </w:p>
         </w:tc>
         <w:tc>
@@ -8647,11 +7742,9 @@
               <w:spacing w:line="278" w:lineRule="auto"/>
               <w:jc w:val="left"/>
             </w:pPr>
-            <w:proofErr w:type="spellStart"/>
             <w:r>
               <w:t>ListingApproval</w:t>
             </w:r>
-            <w:proofErr w:type="spellEnd"/>
           </w:p>
         </w:tc>
         <w:tc>
@@ -8681,11 +7774,9 @@
               <w:jc w:val="left"/>
               <w:cnfStyle w:val="000000000000" w:firstRow="0" w:lastRow="0" w:firstColumn="0" w:lastColumn="0" w:oddVBand="0" w:evenVBand="0" w:oddHBand="0" w:evenHBand="0" w:firstRowFirstColumn="0" w:firstRowLastColumn="0" w:lastRowFirstColumn="0" w:lastRowLastColumn="0"/>
             </w:pPr>
-            <w:proofErr w:type="spellStart"/>
             <w:r>
               <w:t>ListingDashboardTabService</w:t>
             </w:r>
-            <w:proofErr w:type="spellEnd"/>
           </w:p>
         </w:tc>
         <w:tc>
@@ -8749,19 +7840,9 @@
               <w:jc w:val="left"/>
               <w:cnfStyle w:val="000000000000" w:firstRow="0" w:lastRow="0" w:firstColumn="0" w:lastColumn="0" w:oddVBand="0" w:evenVBand="0" w:oddHBand="0" w:evenHBand="0" w:firstRowFirstColumn="0" w:firstRowLastColumn="0" w:lastRowFirstColumn="0" w:lastRowLastColumn="0"/>
             </w:pPr>
-            <w:proofErr w:type="spellStart"/>
-            <w:r>
-              <w:t>OrderService</w:t>
-            </w:r>
-            <w:proofErr w:type="spellEnd"/>
-            <w:r>
-              <w:t>, </w:t>
-            </w:r>
-            <w:proofErr w:type="spellStart"/>
-            <w:r>
-              <w:t>OrderCreateDto</w:t>
-            </w:r>
-            <w:proofErr w:type="spellEnd"/>
+            <w:r>
+              <w:t>OrderService, OrderCreateDto</w:t>
+            </w:r>
           </w:p>
         </w:tc>
         <w:tc>
@@ -8793,11 +7874,9 @@
               <w:spacing w:line="278" w:lineRule="auto"/>
               <w:jc w:val="left"/>
             </w:pPr>
-            <w:proofErr w:type="spellStart"/>
             <w:r>
               <w:t>VendorOrders</w:t>
             </w:r>
-            <w:proofErr w:type="spellEnd"/>
           </w:p>
         </w:tc>
         <w:tc>
@@ -8827,11 +7906,9 @@
               <w:jc w:val="left"/>
               <w:cnfStyle w:val="000000000000" w:firstRow="0" w:lastRow="0" w:firstColumn="0" w:lastColumn="0" w:oddVBand="0" w:evenVBand="0" w:oddHBand="0" w:evenHBand="0" w:firstRowFirstColumn="0" w:firstRowLastColumn="0" w:lastRowFirstColumn="0" w:lastRowLastColumn="0"/>
             </w:pPr>
-            <w:proofErr w:type="spellStart"/>
             <w:r>
               <w:t>OrderDashboardTabService</w:t>
             </w:r>
-            <w:proofErr w:type="spellEnd"/>
           </w:p>
         </w:tc>
         <w:tc>
@@ -8895,21 +7972,9 @@
               <w:jc w:val="left"/>
               <w:cnfStyle w:val="000000000000" w:firstRow="0" w:lastRow="0" w:firstColumn="0" w:lastColumn="0" w:oddVBand="0" w:evenVBand="0" w:oddHBand="0" w:evenHBand="0" w:firstRowFirstColumn="0" w:firstRowLastColumn="0" w:lastRowFirstColumn="0" w:lastRowLastColumn="0"/>
             </w:pPr>
-            <w:proofErr w:type="spellStart"/>
-            <w:proofErr w:type="gramStart"/>
-            <w:r>
-              <w:t>DonationService</w:t>
-            </w:r>
-            <w:proofErr w:type="spellEnd"/>
-            <w:proofErr w:type="gramEnd"/>
-            <w:r>
-              <w:t>, </w:t>
-            </w:r>
-            <w:proofErr w:type="spellStart"/>
-            <w:r>
-              <w:t>DonationCreateDto</w:t>
-            </w:r>
-            <w:proofErr w:type="spellEnd"/>
+            <w:r>
+              <w:t>DonationService, DonationCreateDto</w:t>
+            </w:r>
           </w:p>
         </w:tc>
         <w:tc>
@@ -8973,21 +8038,9 @@
               <w:jc w:val="left"/>
               <w:cnfStyle w:val="000000000000" w:firstRow="0" w:lastRow="0" w:firstColumn="0" w:lastColumn="0" w:oddVBand="0" w:evenVBand="0" w:oddHBand="0" w:evenHBand="0" w:firstRowFirstColumn="0" w:firstRowLastColumn="0" w:lastRowFirstColumn="0" w:lastRowLastColumn="0"/>
             </w:pPr>
-            <w:proofErr w:type="spellStart"/>
-            <w:proofErr w:type="gramStart"/>
-            <w:r>
-              <w:t>ReviewService</w:t>
-            </w:r>
-            <w:proofErr w:type="spellEnd"/>
-            <w:proofErr w:type="gramEnd"/>
-            <w:r>
-              <w:t>, </w:t>
-            </w:r>
-            <w:proofErr w:type="spellStart"/>
-            <w:r>
-              <w:t>CreateReviewDto</w:t>
-            </w:r>
-            <w:proofErr w:type="spellEnd"/>
+            <w:r>
+              <w:t>ReviewService, CreateReviewDto</w:t>
+            </w:r>
           </w:p>
         </w:tc>
         <w:tc>
@@ -9002,13 +8055,8 @@
               <w:cnfStyle w:val="000000000000" w:firstRow="0" w:lastRow="0" w:firstColumn="0" w:lastColumn="0" w:oddVBand="0" w:evenVBand="0" w:oddHBand="0" w:evenHBand="0" w:firstRowFirstColumn="0" w:firstRowLastColumn="0" w:lastRowFirstColumn="0" w:lastRowLastColumn="0"/>
             </w:pPr>
             <w:r>
-              <w:t>Review, </w:t>
-            </w:r>
-            <w:proofErr w:type="spellStart"/>
-            <w:r>
-              <w:t>SentimentAnalysis</w:t>
-            </w:r>
-            <w:proofErr w:type="spellEnd"/>
+              <w:t>Review, SentimentAnalysis</w:t>
+            </w:r>
           </w:p>
         </w:tc>
       </w:tr>
@@ -9056,11 +8104,9 @@
               <w:jc w:val="left"/>
               <w:cnfStyle w:val="000000000000" w:firstRow="0" w:lastRow="0" w:firstColumn="0" w:lastColumn="0" w:oddVBand="0" w:evenVBand="0" w:oddHBand="0" w:evenHBand="0" w:firstRowFirstColumn="0" w:firstRowLastColumn="0" w:lastRowFirstColumn="0" w:lastRowLastColumn="0"/>
             </w:pPr>
-            <w:proofErr w:type="spellStart"/>
             <w:r>
               <w:t>ReportService</w:t>
             </w:r>
-            <w:proofErr w:type="spellEnd"/>
           </w:p>
         </w:tc>
         <w:tc>
@@ -9124,11 +8170,9 @@
               <w:jc w:val="left"/>
               <w:cnfStyle w:val="000000000000" w:firstRow="0" w:lastRow="0" w:firstColumn="0" w:lastColumn="0" w:oddVBand="0" w:evenVBand="0" w:oddHBand="0" w:evenHBand="0" w:firstRowFirstColumn="0" w:firstRowLastColumn="0" w:lastRowFirstColumn="0" w:lastRowLastColumn="0"/>
             </w:pPr>
-            <w:proofErr w:type="spellStart"/>
             <w:r>
               <w:t>HelpAndSupportService</w:t>
             </w:r>
-            <w:proofErr w:type="spellEnd"/>
           </w:p>
         </w:tc>
         <w:tc>
@@ -9160,11 +8204,9 @@
               <w:spacing w:line="278" w:lineRule="auto"/>
               <w:jc w:val="left"/>
             </w:pPr>
-            <w:proofErr w:type="spellStart"/>
             <w:r>
               <w:t>VendorDashboard</w:t>
             </w:r>
-            <w:proofErr w:type="spellEnd"/>
           </w:p>
         </w:tc>
         <w:tc>
@@ -9194,11 +8236,9 @@
               <w:jc w:val="left"/>
               <w:cnfStyle w:val="000000000000" w:firstRow="0" w:lastRow="0" w:firstColumn="0" w:lastColumn="0" w:oddVBand="0" w:evenVBand="0" w:oddHBand="0" w:evenHBand="0" w:firstRowFirstColumn="0" w:firstRowLastColumn="0" w:lastRowFirstColumn="0" w:lastRowLastColumn="0"/>
             </w:pPr>
-            <w:proofErr w:type="spellStart"/>
             <w:r>
               <w:t>VendorDashboardService</w:t>
             </w:r>
-            <w:proofErr w:type="spellEnd"/>
           </w:p>
         </w:tc>
         <w:tc>
@@ -9230,11 +8270,9 @@
               <w:spacing w:line="278" w:lineRule="auto"/>
               <w:jc w:val="left"/>
             </w:pPr>
-            <w:proofErr w:type="spellStart"/>
             <w:r>
               <w:t>VendorAnalytics</w:t>
             </w:r>
-            <w:proofErr w:type="spellEnd"/>
           </w:p>
         </w:tc>
         <w:tc>
@@ -9264,11 +8302,9 @@
               <w:jc w:val="left"/>
               <w:cnfStyle w:val="000000000000" w:firstRow="0" w:lastRow="0" w:firstColumn="0" w:lastColumn="0" w:oddVBand="0" w:evenVBand="0" w:oddHBand="0" w:evenHBand="0" w:firstRowFirstColumn="0" w:firstRowLastColumn="0" w:lastRowFirstColumn="0" w:lastRowLastColumn="0"/>
             </w:pPr>
-            <w:proofErr w:type="spellStart"/>
             <w:r>
               <w:t>AnalyticsDashboardTabService</w:t>
             </w:r>
-            <w:proofErr w:type="spellEnd"/>
           </w:p>
         </w:tc>
         <w:tc>
@@ -9300,11 +8336,9 @@
               <w:spacing w:line="278" w:lineRule="auto"/>
               <w:jc w:val="left"/>
             </w:pPr>
-            <w:proofErr w:type="spellStart"/>
             <w:r>
               <w:t>VendorListings</w:t>
             </w:r>
-            <w:proofErr w:type="spellEnd"/>
           </w:p>
         </w:tc>
         <w:tc>
@@ -9334,11 +8368,9 @@
               <w:jc w:val="left"/>
               <w:cnfStyle w:val="000000000000" w:firstRow="0" w:lastRow="0" w:firstColumn="0" w:lastColumn="0" w:oddVBand="0" w:evenVBand="0" w:oddHBand="0" w:evenHBand="0" w:firstRowFirstColumn="0" w:firstRowLastColumn="0" w:lastRowFirstColumn="0" w:lastRowLastColumn="0"/>
             </w:pPr>
-            <w:proofErr w:type="spellStart"/>
             <w:r>
               <w:t>ListingDashboardTabService</w:t>
             </w:r>
-            <w:proofErr w:type="spellEnd"/>
           </w:p>
         </w:tc>
         <w:tc>
@@ -9370,11 +8402,9 @@
               <w:spacing w:line="278" w:lineRule="auto"/>
               <w:jc w:val="left"/>
             </w:pPr>
-            <w:proofErr w:type="spellStart"/>
             <w:r>
               <w:t>ActivityLogs</w:t>
             </w:r>
-            <w:proofErr w:type="spellEnd"/>
           </w:p>
         </w:tc>
         <w:tc>
@@ -9404,11 +8434,9 @@
               <w:jc w:val="left"/>
               <w:cnfStyle w:val="000000000000" w:firstRow="0" w:lastRow="0" w:firstColumn="0" w:lastColumn="0" w:oddVBand="0" w:evenVBand="0" w:oddHBand="0" w:evenHBand="0" w:firstRowFirstColumn="0" w:firstRowLastColumn="0" w:lastRowFirstColumn="0" w:lastRowLastColumn="0"/>
             </w:pPr>
-            <w:proofErr w:type="spellStart"/>
             <w:r>
               <w:t>LogsService</w:t>
             </w:r>
-            <w:proofErr w:type="spellEnd"/>
           </w:p>
         </w:tc>
         <w:tc>
@@ -9422,11 +8450,9 @@
               <w:jc w:val="left"/>
               <w:cnfStyle w:val="000000000000" w:firstRow="0" w:lastRow="0" w:firstColumn="0" w:lastColumn="0" w:oddVBand="0" w:evenVBand="0" w:oddHBand="0" w:evenHBand="0" w:firstRowFirstColumn="0" w:firstRowLastColumn="0" w:lastRowFirstColumn="0" w:lastRowLastColumn="0"/>
             </w:pPr>
-            <w:proofErr w:type="spellStart"/>
             <w:r>
               <w:t>ActivityLog</w:t>
             </w:r>
-            <w:proofErr w:type="spellEnd"/>
           </w:p>
         </w:tc>
       </w:tr>
@@ -9442,11 +8468,9 @@
               <w:spacing w:line="278" w:lineRule="auto"/>
               <w:jc w:val="left"/>
             </w:pPr>
-            <w:proofErr w:type="spellStart"/>
             <w:r>
               <w:t>AdminController</w:t>
             </w:r>
-            <w:proofErr w:type="spellEnd"/>
           </w:p>
         </w:tc>
         <w:tc>
@@ -9476,11 +8500,9 @@
               <w:jc w:val="left"/>
               <w:cnfStyle w:val="000000000000" w:firstRow="0" w:lastRow="0" w:firstColumn="0" w:lastColumn="0" w:oddVBand="0" w:evenVBand="0" w:oddHBand="0" w:evenHBand="0" w:firstRowFirstColumn="0" w:firstRowLastColumn="0" w:lastRowFirstColumn="0" w:lastRowLastColumn="0"/>
             </w:pPr>
-            <w:proofErr w:type="spellStart"/>
             <w:r>
               <w:t>AdminService</w:t>
             </w:r>
-            <w:proofErr w:type="spellEnd"/>
           </w:p>
         </w:tc>
         <w:tc>
@@ -9515,23 +8537,7 @@
           <w:szCs w:val="24"/>
         </w:rPr>
         <w:lastRenderedPageBreak/>
-        <w:t xml:space="preserve">4.2.2 </w:t>
-      </w:r>
-      <w:proofErr w:type="spellStart"/>
-      <w:r>
-        <w:rPr>
-          <w:color w:val="000000" w:themeColor="text1"/>
-          <w:szCs w:val="24"/>
-        </w:rPr>
-        <w:t>FastAPI</w:t>
-      </w:r>
-      <w:proofErr w:type="spellEnd"/>
-      <w:r>
-        <w:rPr>
-          <w:color w:val="000000" w:themeColor="text1"/>
-          <w:szCs w:val="24"/>
-        </w:rPr>
-        <w:t xml:space="preserve"> AI Microservice</w:t>
+        <w:t>4.2.2 FastAPI AI Microservice</w:t>
       </w:r>
     </w:p>
     <w:p>
@@ -9757,15 +8763,7 @@
         <w:jc w:val="left"/>
       </w:pPr>
       <w:r>
-        <w:t xml:space="preserve">The </w:t>
-      </w:r>
-      <w:proofErr w:type="gramStart"/>
-      <w:r>
-        <w:t>Admin</w:t>
-      </w:r>
-      <w:proofErr w:type="gramEnd"/>
-      <w:r>
-        <w:t xml:space="preserve"> web panel is built as a single-page client dashboard that provides the primary interface for system moderation and data visualization:</w:t>
+        <w:t>The Admin web panel is built as a single-page client dashboard that provides the primary interface for system moderation and data visualization:</w:t>
       </w:r>
     </w:p>
     <w:p>
@@ -9782,23 +8780,7 @@
           <w:b/>
           <w:bCs/>
         </w:rPr>
-        <w:t>Dashboard &amp; Analytics Module (</w:t>
-      </w:r>
-      <w:proofErr w:type="spellStart"/>
-      <w:r>
-        <w:rPr>
-          <w:b/>
-          <w:bCs/>
-        </w:rPr>
-        <w:t>DashboardView.tsx</w:t>
-      </w:r>
-      <w:proofErr w:type="spellEnd"/>
-      <w:r>
-        <w:rPr>
-          <w:b/>
-          <w:bCs/>
-        </w:rPr>
-        <w:t>)</w:t>
+        <w:t>Dashboard &amp; Analytics Module (DashboardView.tsx)</w:t>
       </w:r>
       <w:r>
         <w:t>:</w:t>
@@ -9855,23 +8837,7 @@
           <w:bCs/>
         </w:rPr>
         <w:lastRenderedPageBreak/>
-        <w:t>Flagged Content Moderation Module (</w:t>
-      </w:r>
-      <w:proofErr w:type="spellStart"/>
-      <w:r>
-        <w:rPr>
-          <w:b/>
-          <w:bCs/>
-        </w:rPr>
-        <w:t>ModerationView.tsx</w:t>
-      </w:r>
-      <w:proofErr w:type="spellEnd"/>
-      <w:r>
-        <w:rPr>
-          <w:b/>
-          <w:bCs/>
-        </w:rPr>
-        <w:t>)</w:t>
+        <w:t>Flagged Content Moderation Module (ModerationView.tsx)</w:t>
       </w:r>
       <w:r>
         <w:t>:</w:t>
@@ -9945,13 +8911,8 @@
         <w:spacing w:line="278" w:lineRule="auto"/>
         <w:jc w:val="left"/>
       </w:pPr>
-      <w:proofErr w:type="gramStart"/>
-      <w:r>
-        <w:t>Grants</w:t>
-      </w:r>
-      <w:proofErr w:type="gramEnd"/>
-      <w:r>
-        <w:t xml:space="preserve"> business permissions and flags new vendor locations on the interactive map system.</w:t>
+      <w:r>
+        <w:t>Grants business permissions and flags new vendor locations on the interactive map system.</w:t>
       </w:r>
     </w:p>
     <w:p>
@@ -9989,21 +8950,12 @@
       <w:r>
         <w:t>The customer-facing application is built using Flutter and structured around distinct features in the lib/Features/ folder. State management is organized around </w:t>
       </w:r>
-      <w:proofErr w:type="spellStart"/>
       <w:r>
         <w:rPr>
           <w:b/>
           <w:bCs/>
         </w:rPr>
-        <w:t>BLoC</w:t>
-      </w:r>
-      <w:proofErr w:type="spellEnd"/>
-      <w:r>
-        <w:rPr>
-          <w:b/>
-          <w:bCs/>
-        </w:rPr>
-        <w:t xml:space="preserve"> Cubits</w:t>
+        <w:t>BLoC Cubits</w:t>
       </w:r>
       <w:r>
         <w:t>:</w:t>
@@ -10038,21 +8990,8 @@
         <w:spacing w:line="278" w:lineRule="auto"/>
         <w:jc w:val="left"/>
       </w:pPr>
-      <w:proofErr w:type="gramStart"/>
-      <w:r>
-        <w:t>Employs</w:t>
-      </w:r>
-      <w:proofErr w:type="gramEnd"/>
-      <w:r>
-        <w:t> </w:t>
-      </w:r>
-      <w:proofErr w:type="spellStart"/>
-      <w:r>
-        <w:t>google_maps_flutter</w:t>
-      </w:r>
-      <w:proofErr w:type="spellEnd"/>
-      <w:r>
-        <w:t> overlay widgets to display nearest vendor locations.</w:t>
+      <w:r>
+        <w:t>Employs google_maps_flutter overlay widgets to display nearest vendor locations.</w:t>
       </w:r>
     </w:p>
     <w:p>
@@ -10409,15 +9348,7 @@
               <w:cnfStyle w:val="000000000000" w:firstRow="0" w:lastRow="0" w:firstColumn="0" w:lastColumn="0" w:oddVBand="0" w:evenVBand="0" w:oddHBand="0" w:evenHBand="0" w:firstRowFirstColumn="0" w:firstRowLastColumn="0" w:lastRowFirstColumn="0" w:lastRowLastColumn="0"/>
             </w:pPr>
             <w:r>
-              <w:t xml:space="preserve">RAM spikes (~1.1 GB) on </w:t>
-            </w:r>
-            <w:proofErr w:type="spellStart"/>
-            <w:r>
-              <w:t>FastAPI</w:t>
-            </w:r>
-            <w:proofErr w:type="spellEnd"/>
-            <w:r>
-              <w:t xml:space="preserve"> container startup exceeding Railway's free-tier limits.</w:t>
+              <w:t>RAM spikes (~1.1 GB) on FastAPI container startup exceeding Railway's free-tier limits.</w:t>
             </w:r>
           </w:p>
         </w:tc>
@@ -10433,15 +9364,7 @@
               <w:cnfStyle w:val="000000000000" w:firstRow="0" w:lastRow="0" w:firstColumn="0" w:lastColumn="0" w:oddVBand="0" w:evenVBand="0" w:oddHBand="0" w:evenHBand="0" w:firstRowFirstColumn="0" w:firstRowLastColumn="0" w:lastRowFirstColumn="0" w:lastRowLastColumn="0"/>
             </w:pPr>
             <w:r>
-              <w:t xml:space="preserve">Implemented lazy-loaded </w:t>
-            </w:r>
-            <w:proofErr w:type="spellStart"/>
-            <w:r>
-              <w:t>HuggingFace</w:t>
-            </w:r>
-            <w:proofErr w:type="spellEnd"/>
-            <w:r>
-              <w:t xml:space="preserve"> pipelines, initializing on the first request.</w:t>
+              <w:t>Implemented lazy-loaded HuggingFace pipelines, initializing on the first request.</w:t>
             </w:r>
           </w:p>
         </w:tc>
@@ -10456,13 +9379,8 @@
               <w:jc w:val="left"/>
               <w:cnfStyle w:val="000000000000" w:firstRow="0" w:lastRow="0" w:firstColumn="0" w:lastColumn="0" w:oddVBand="0" w:evenVBand="0" w:oddHBand="0" w:evenHBand="0" w:firstRowFirstColumn="0" w:firstRowLastColumn="0" w:lastRowFirstColumn="0" w:lastRowLastColumn="0"/>
             </w:pPr>
-            <w:proofErr w:type="gramStart"/>
-            <w:r>
-              <w:t>Prevented</w:t>
-            </w:r>
-            <w:proofErr w:type="gramEnd"/>
-            <w:r>
-              <w:t xml:space="preserve"> cold-boot crashes and container terminations.</w:t>
+            <w:r>
+              <w:t>Prevented cold-boot crashes and container terminations.</w:t>
             </w:r>
           </w:p>
         </w:tc>
@@ -10581,23 +9499,7 @@
               <w:cnfStyle w:val="000000000000" w:firstRow="0" w:lastRow="0" w:firstColumn="0" w:lastColumn="0" w:oddVBand="0" w:evenVBand="0" w:oddHBand="0" w:evenHBand="0" w:firstRowFirstColumn="0" w:firstRowLastColumn="0" w:lastRowFirstColumn="0" w:lastRowLastColumn="0"/>
             </w:pPr>
             <w:r>
-              <w:t xml:space="preserve">Created an in-memory dictionary inside the </w:t>
-            </w:r>
-            <w:proofErr w:type="spellStart"/>
-            <w:r>
-              <w:t>SignalR</w:t>
-            </w:r>
-            <w:proofErr w:type="spellEnd"/>
-            <w:r>
-              <w:t> </w:t>
-            </w:r>
-            <w:proofErr w:type="spellStart"/>
-            <w:r>
-              <w:t>PresenceHub</w:t>
-            </w:r>
-            <w:proofErr w:type="spellEnd"/>
-            <w:r>
-              <w:t> to map connections.</w:t>
+              <w:t>Created an in-memory dictionary inside the SignalR PresenceHub to map connections.</w:t>
             </w:r>
           </w:p>
         </w:tc>
@@ -10801,15 +9703,7 @@
               <w:cnfStyle w:val="000000100000" w:firstRow="0" w:lastRow="0" w:firstColumn="0" w:lastColumn="0" w:oddVBand="0" w:evenVBand="0" w:oddHBand="1" w:evenHBand="0" w:firstRowFirstColumn="0" w:firstRowLastColumn="0" w:lastRowFirstColumn="0" w:lastRowLastColumn="0"/>
             </w:pPr>
             <w:r>
-              <w:t>Integrated </w:t>
-            </w:r>
-            <w:proofErr w:type="spellStart"/>
-            <w:r>
-              <w:t>cached_network_image</w:t>
-            </w:r>
-            <w:proofErr w:type="spellEnd"/>
-            <w:r>
-              <w:t> to store vendor logos locally on disk.</w:t>
+              <w:t>Integrated cached_network_image to store vendor logos locally on disk.</w:t>
             </w:r>
           </w:p>
         </w:tc>
@@ -10874,15 +9768,7 @@
         <w:jc w:val="left"/>
       </w:pPr>
       <w:r>
-        <w:t xml:space="preserve">In the data preparation stage, training category-specific classifiers (such as Bread) resulted in poor validation accuracies due to extreme class imbalances. To solve this, the pipeline was rewritten to enforce a ceiling of 600 images per class and dynamically compute class weights in </w:t>
-      </w:r>
-      <w:proofErr w:type="spellStart"/>
-      <w:r>
-        <w:t>Keras</w:t>
-      </w:r>
-      <w:proofErr w:type="spellEnd"/>
-      <w:r>
-        <w:t>:</w:t>
+        <w:t>In the data preparation stage, training category-specific classifiers (such as Bread) resulted in poor validation accuracies due to extreme class imbalances. To solve this, the pipeline was rewritten to enforce a ceiling of 600 images per class and dynamically compute class weights in Keras:</w:t>
       </w:r>
     </w:p>
     <w:p>
@@ -10928,7 +9814,6 @@
         </w:rPr>
         <w:t xml:space="preserve">1. </w:t>
       </w:r>
-      <w:proofErr w:type="spellStart"/>
       <w:r>
         <w:rPr>
           <w:rFonts w:ascii="Consolas" w:hAnsi="Consolas" w:cs="Courier New"/>
@@ -10936,9 +9821,17 @@
           <w:sz w:val="17"/>
           <w:szCs w:val="17"/>
         </w:rPr>
-        <w:t>class_weights</w:t>
-      </w:r>
-      <w:proofErr w:type="spellEnd"/>
+        <w:t xml:space="preserve">class_weights </w:t>
+      </w:r>
+      <w:r>
+        <w:rPr>
+          <w:rFonts w:ascii="Consolas" w:hAnsi="Consolas" w:cs="Courier New"/>
+          <w:color w:val="666600"/>
+          <w:sz w:val="17"/>
+          <w:szCs w:val="17"/>
+        </w:rPr>
+        <w:t>=</w:t>
+      </w:r>
       <w:r>
         <w:rPr>
           <w:rFonts w:ascii="Consolas" w:hAnsi="Consolas" w:cs="Courier New"/>
@@ -10946,7 +9839,7 @@
           <w:sz w:val="17"/>
           <w:szCs w:val="17"/>
         </w:rPr>
-        <w:t xml:space="preserve"> </w:t>
+        <w:t xml:space="preserve"> class_weight</w:t>
       </w:r>
       <w:r>
         <w:rPr>
@@ -10955,7 +9848,7 @@
           <w:sz w:val="17"/>
           <w:szCs w:val="17"/>
         </w:rPr>
-        <w:t>=</w:t>
+        <w:t>.</w:t>
       </w:r>
       <w:r>
         <w:rPr>
@@ -10964,27 +9857,7 @@
           <w:sz w:val="17"/>
           <w:szCs w:val="17"/>
         </w:rPr>
-        <w:t xml:space="preserve"> </w:t>
-      </w:r>
-      <w:proofErr w:type="spellStart"/>
-      <w:r>
-        <w:rPr>
-          <w:rFonts w:ascii="Consolas" w:hAnsi="Consolas" w:cs="Courier New"/>
-          <w:color w:val="000000"/>
-          <w:sz w:val="17"/>
-          <w:szCs w:val="17"/>
-        </w:rPr>
-        <w:t>class_</w:t>
-      </w:r>
-      <w:proofErr w:type="gramStart"/>
-      <w:r>
-        <w:rPr>
-          <w:rFonts w:ascii="Consolas" w:hAnsi="Consolas" w:cs="Courier New"/>
-          <w:color w:val="000000"/>
-          <w:sz w:val="17"/>
-          <w:szCs w:val="17"/>
-        </w:rPr>
-        <w:t>weight</w:t>
+        <w:t>compute_class_weight</w:t>
       </w:r>
       <w:r>
         <w:rPr>
@@ -10993,48 +9866,8 @@
           <w:sz w:val="17"/>
           <w:szCs w:val="17"/>
         </w:rPr>
-        <w:t>.</w:t>
-      </w:r>
-      <w:r>
-        <w:rPr>
-          <w:rFonts w:ascii="Consolas" w:hAnsi="Consolas" w:cs="Courier New"/>
-          <w:color w:val="000000"/>
-          <w:sz w:val="17"/>
-          <w:szCs w:val="17"/>
-        </w:rPr>
-        <w:t>compute</w:t>
-      </w:r>
-      <w:proofErr w:type="gramEnd"/>
-      <w:r>
-        <w:rPr>
-          <w:rFonts w:ascii="Consolas" w:hAnsi="Consolas" w:cs="Courier New"/>
-          <w:color w:val="000000"/>
-          <w:sz w:val="17"/>
-          <w:szCs w:val="17"/>
-        </w:rPr>
-        <w:t>_class_</w:t>
-      </w:r>
-      <w:proofErr w:type="gramStart"/>
-      <w:r>
-        <w:rPr>
-          <w:rFonts w:ascii="Consolas" w:hAnsi="Consolas" w:cs="Courier New"/>
-          <w:color w:val="000000"/>
-          <w:sz w:val="17"/>
-          <w:szCs w:val="17"/>
-        </w:rPr>
-        <w:t>weight</w:t>
-      </w:r>
-      <w:proofErr w:type="spellEnd"/>
-      <w:r>
-        <w:rPr>
-          <w:rFonts w:ascii="Consolas" w:hAnsi="Consolas" w:cs="Courier New"/>
-          <w:color w:val="666600"/>
-          <w:sz w:val="17"/>
-          <w:szCs w:val="17"/>
-        </w:rPr>
         <w:t>(</w:t>
       </w:r>
-      <w:proofErr w:type="gramEnd"/>
     </w:p>
     <w:p>
       <w:pPr>
@@ -11168,8 +10001,6 @@
         </w:rPr>
         <w:t>=</w:t>
       </w:r>
-      <w:proofErr w:type="spellStart"/>
-      <w:proofErr w:type="gramStart"/>
       <w:r>
         <w:rPr>
           <w:rFonts w:ascii="Consolas" w:hAnsi="Consolas" w:cs="Courier New"/>
@@ -11197,8 +10028,6 @@
         </w:rPr>
         <w:t>unique</w:t>
       </w:r>
-      <w:proofErr w:type="spellEnd"/>
-      <w:proofErr w:type="gramEnd"/>
       <w:r>
         <w:rPr>
           <w:rFonts w:ascii="Consolas" w:hAnsi="Consolas" w:cs="Courier New"/>
@@ -11208,7 +10037,6 @@
         </w:rPr>
         <w:t>(</w:t>
       </w:r>
-      <w:proofErr w:type="spellStart"/>
       <w:r>
         <w:rPr>
           <w:rFonts w:ascii="Consolas" w:hAnsi="Consolas" w:cs="Courier New"/>
@@ -11216,9 +10044,17 @@
           <w:sz w:val="17"/>
           <w:szCs w:val="17"/>
         </w:rPr>
-        <w:t>train_</w:t>
-      </w:r>
-      <w:proofErr w:type="gramStart"/>
+        <w:t>train_generator</w:t>
+      </w:r>
+      <w:r>
+        <w:rPr>
+          <w:rFonts w:ascii="Consolas" w:hAnsi="Consolas" w:cs="Courier New"/>
+          <w:color w:val="666600"/>
+          <w:sz w:val="17"/>
+          <w:szCs w:val="17"/>
+        </w:rPr>
+        <w:t>.</w:t>
+      </w:r>
       <w:r>
         <w:rPr>
           <w:rFonts w:ascii="Consolas" w:hAnsi="Consolas" w:cs="Courier New"/>
@@ -11226,28 +10062,8 @@
           <w:sz w:val="17"/>
           <w:szCs w:val="17"/>
         </w:rPr>
-        <w:t>generator</w:t>
-      </w:r>
-      <w:r>
-        <w:rPr>
-          <w:rFonts w:ascii="Consolas" w:hAnsi="Consolas" w:cs="Courier New"/>
-          <w:color w:val="666600"/>
-          <w:sz w:val="17"/>
-          <w:szCs w:val="17"/>
-        </w:rPr>
-        <w:t>.</w:t>
-      </w:r>
-      <w:r>
-        <w:rPr>
-          <w:rFonts w:ascii="Consolas" w:hAnsi="Consolas" w:cs="Courier New"/>
-          <w:color w:val="000000"/>
-          <w:sz w:val="17"/>
-          <w:szCs w:val="17"/>
-        </w:rPr>
         <w:t>classes</w:t>
       </w:r>
-      <w:proofErr w:type="spellEnd"/>
-      <w:proofErr w:type="gramEnd"/>
       <w:r>
         <w:rPr>
           <w:rFonts w:ascii="Consolas" w:hAnsi="Consolas" w:cs="Courier New"/>
@@ -11319,7 +10135,6 @@
         </w:rPr>
         <w:t>=</w:t>
       </w:r>
-      <w:proofErr w:type="spellStart"/>
       <w:r>
         <w:rPr>
           <w:rFonts w:ascii="Consolas" w:hAnsi="Consolas" w:cs="Courier New"/>
@@ -11327,9 +10142,17 @@
           <w:sz w:val="17"/>
           <w:szCs w:val="17"/>
         </w:rPr>
-        <w:t>train_</w:t>
-      </w:r>
-      <w:proofErr w:type="gramStart"/>
+        <w:t>train_generator</w:t>
+      </w:r>
+      <w:r>
+        <w:rPr>
+          <w:rFonts w:ascii="Consolas" w:hAnsi="Consolas" w:cs="Courier New"/>
+          <w:color w:val="666600"/>
+          <w:sz w:val="17"/>
+          <w:szCs w:val="17"/>
+        </w:rPr>
+        <w:t>.</w:t>
+      </w:r>
       <w:r>
         <w:rPr>
           <w:rFonts w:ascii="Consolas" w:hAnsi="Consolas" w:cs="Courier New"/>
@@ -11337,28 +10160,8 @@
           <w:sz w:val="17"/>
           <w:szCs w:val="17"/>
         </w:rPr>
-        <w:t>generator</w:t>
-      </w:r>
-      <w:r>
-        <w:rPr>
-          <w:rFonts w:ascii="Consolas" w:hAnsi="Consolas" w:cs="Courier New"/>
-          <w:color w:val="666600"/>
-          <w:sz w:val="17"/>
-          <w:szCs w:val="17"/>
-        </w:rPr>
-        <w:t>.</w:t>
-      </w:r>
-      <w:r>
-        <w:rPr>
-          <w:rFonts w:ascii="Consolas" w:hAnsi="Consolas" w:cs="Courier New"/>
-          <w:color w:val="000000"/>
-          <w:sz w:val="17"/>
-          <w:szCs w:val="17"/>
-        </w:rPr>
         <w:t>classes</w:t>
       </w:r>
-      <w:proofErr w:type="spellEnd"/>
-      <w:proofErr w:type="gramEnd"/>
     </w:p>
     <w:p>
       <w:pPr>
@@ -11410,15 +10213,7 @@
         <w:jc w:val="left"/>
       </w:pPr>
       <w:r>
-        <w:t>Additionally, during the processing of over 100,000 images, standard PIL decoders threw </w:t>
-      </w:r>
-      <w:proofErr w:type="spellStart"/>
-      <w:r>
-        <w:t>OSError</w:t>
-      </w:r>
-      <w:proofErr w:type="spellEnd"/>
-      <w:r>
-        <w:t>: broken data stream on corrupted JPEG files. This was solved by configuring:</w:t>
+        <w:t>Additionally, during the processing of over 100,000 images, standard PIL decoders threw OSError: broken data stream on corrupted JPEG files. This was solved by configuring:</w:t>
       </w:r>
     </w:p>
     <w:p>
@@ -11500,7 +10295,6 @@
         </w:rPr>
         <w:t xml:space="preserve"> </w:t>
       </w:r>
-      <w:proofErr w:type="spellStart"/>
       <w:r>
         <w:rPr>
           <w:rFonts w:ascii="Consolas" w:hAnsi="Consolas" w:cs="Courier New"/>
@@ -11510,7 +10304,6 @@
         </w:rPr>
         <w:t>ImageFile</w:t>
       </w:r>
-      <w:proofErr w:type="spellEnd"/>
     </w:p>
     <w:p>
       <w:pPr>
@@ -11555,7 +10348,6 @@
         </w:rPr>
         <w:t xml:space="preserve">2. </w:t>
       </w:r>
-      <w:proofErr w:type="spellStart"/>
       <w:r>
         <w:rPr>
           <w:rFonts w:ascii="Consolas" w:hAnsi="Consolas" w:cs="Courier New"/>
@@ -11581,9 +10373,17 @@
           <w:sz w:val="17"/>
           <w:szCs w:val="17"/>
         </w:rPr>
-        <w:t>LOAD_TRUNCATED_IMAGES</w:t>
-      </w:r>
-      <w:proofErr w:type="spellEnd"/>
+        <w:t xml:space="preserve">LOAD_TRUNCATED_IMAGES </w:t>
+      </w:r>
+      <w:r>
+        <w:rPr>
+          <w:rFonts w:ascii="Consolas" w:hAnsi="Consolas" w:cs="Courier New"/>
+          <w:color w:val="666600"/>
+          <w:sz w:val="17"/>
+          <w:szCs w:val="17"/>
+        </w:rPr>
+        <w:t>=</w:t>
+      </w:r>
       <w:r>
         <w:rPr>
           <w:rFonts w:ascii="Consolas" w:hAnsi="Consolas" w:cs="Courier New"/>
@@ -11596,24 +10396,6 @@
       <w:r>
         <w:rPr>
           <w:rFonts w:ascii="Consolas" w:hAnsi="Consolas" w:cs="Courier New"/>
-          <w:color w:val="666600"/>
-          <w:sz w:val="17"/>
-          <w:szCs w:val="17"/>
-        </w:rPr>
-        <w:t>=</w:t>
-      </w:r>
-      <w:r>
-        <w:rPr>
-          <w:rFonts w:ascii="Consolas" w:hAnsi="Consolas" w:cs="Courier New"/>
-          <w:color w:val="000000"/>
-          <w:sz w:val="17"/>
-          <w:szCs w:val="17"/>
-        </w:rPr>
-        <w:t xml:space="preserve"> </w:t>
-      </w:r>
-      <w:r>
-        <w:rPr>
-          <w:rFonts w:ascii="Consolas" w:hAnsi="Consolas" w:cs="Courier New"/>
           <w:color w:val="000088"/>
           <w:sz w:val="17"/>
           <w:szCs w:val="17"/>
@@ -11642,15 +10424,7 @@
         <w:jc w:val="left"/>
       </w:pPr>
       <w:r>
-        <w:t xml:space="preserve">Deploying transformer models inside serverless Docker instances presented memory limitations. The mDeBERTa-v3 model loaded standard weights into memory on startup, causing the Docker container to exceed Railway's RAM allocations and crash. By wrapping the pipeline initialization inside a lazy-load singleton helper, memory allocation is deferred until a client </w:t>
-      </w:r>
-      <w:proofErr w:type="gramStart"/>
-      <w:r>
-        <w:t>actually triggers /sentiment</w:t>
-      </w:r>
-      <w:proofErr w:type="gramEnd"/>
-      <w:r>
-        <w:t>:</w:t>
+        <w:t>Deploying transformer models inside serverless Docker instances presented memory limitations. The mDeBERTa-v3 model loaded standard weights into memory on startup, causing the Docker container to exceed Railway's RAM allocations and crash. By wrapping the pipeline initialization inside a lazy-load singleton helper, memory allocation is deferred until a client actually triggers /sentiment:</w:t>
       </w:r>
     </w:p>
     <w:p>
@@ -11712,29 +10486,8 @@
           <w:sz w:val="17"/>
           <w:szCs w:val="17"/>
         </w:rPr>
-        <w:t xml:space="preserve"> </w:t>
-      </w:r>
-      <w:proofErr w:type="spellStart"/>
-      <w:r>
-        <w:rPr>
-          <w:rFonts w:ascii="Consolas" w:hAnsi="Consolas" w:cs="Courier New"/>
-          <w:color w:val="000000"/>
-          <w:sz w:val="17"/>
-          <w:szCs w:val="17"/>
-        </w:rPr>
-        <w:t>get_sentiment_</w:t>
-      </w:r>
-      <w:proofErr w:type="gramStart"/>
-      <w:r>
-        <w:rPr>
-          <w:rFonts w:ascii="Consolas" w:hAnsi="Consolas" w:cs="Courier New"/>
-          <w:color w:val="000000"/>
-          <w:sz w:val="17"/>
-          <w:szCs w:val="17"/>
-        </w:rPr>
-        <w:t>classifier</w:t>
-      </w:r>
-      <w:proofErr w:type="spellEnd"/>
+        <w:t xml:space="preserve"> get_sentiment_classifier</w:t>
+      </w:r>
       <w:r>
         <w:rPr>
           <w:rFonts w:ascii="Consolas" w:hAnsi="Consolas" w:cs="Courier New"/>
@@ -11742,17 +10495,7 @@
           <w:sz w:val="17"/>
           <w:szCs w:val="17"/>
         </w:rPr>
-        <w:t>(</w:t>
-      </w:r>
-      <w:proofErr w:type="gramEnd"/>
-      <w:r>
-        <w:rPr>
-          <w:rFonts w:ascii="Consolas" w:hAnsi="Consolas" w:cs="Courier New"/>
-          <w:color w:val="666600"/>
-          <w:sz w:val="17"/>
-          <w:szCs w:val="17"/>
-        </w:rPr>
-        <w:t>):</w:t>
+        <w:t>():</w:t>
       </w:r>
     </w:p>
     <w:p>
@@ -11823,19 +10566,8 @@
           <w:sz w:val="17"/>
           <w:szCs w:val="17"/>
         </w:rPr>
-        <w:t xml:space="preserve"> </w:t>
-      </w:r>
-      <w:proofErr w:type="spellStart"/>
-      <w:r>
-        <w:rPr>
-          <w:rFonts w:ascii="Consolas" w:hAnsi="Consolas" w:cs="Courier New"/>
-          <w:color w:val="000000"/>
-          <w:sz w:val="17"/>
-          <w:szCs w:val="17"/>
-        </w:rPr>
-        <w:t>sentiment_model</w:t>
-      </w:r>
-      <w:proofErr w:type="spellEnd"/>
+        <w:t xml:space="preserve"> sentiment_model</w:t>
+      </w:r>
     </w:p>
     <w:p>
       <w:pPr>
@@ -11905,27 +10637,7 @@
           <w:sz w:val="17"/>
           <w:szCs w:val="17"/>
         </w:rPr>
-        <w:t xml:space="preserve"> </w:t>
-      </w:r>
-      <w:proofErr w:type="spellStart"/>
-      <w:r>
-        <w:rPr>
-          <w:rFonts w:ascii="Consolas" w:hAnsi="Consolas" w:cs="Courier New"/>
-          <w:color w:val="000000"/>
-          <w:sz w:val="17"/>
-          <w:szCs w:val="17"/>
-        </w:rPr>
-        <w:t>sentiment_model</w:t>
-      </w:r>
-      <w:proofErr w:type="spellEnd"/>
-      <w:r>
-        <w:rPr>
-          <w:rFonts w:ascii="Consolas" w:hAnsi="Consolas" w:cs="Courier New"/>
-          <w:color w:val="000000"/>
-          <w:sz w:val="17"/>
-          <w:szCs w:val="17"/>
-        </w:rPr>
-        <w:t xml:space="preserve"> </w:t>
+        <w:t xml:space="preserve"> sentiment_model </w:t>
       </w:r>
       <w:r>
         <w:rPr>
@@ -12014,29 +10726,8 @@
           <w:sz w:val="17"/>
           <w:szCs w:val="17"/>
         </w:rPr>
-        <w:t xml:space="preserve">        </w:t>
-      </w:r>
-      <w:proofErr w:type="spellStart"/>
-      <w:r>
-        <w:rPr>
-          <w:rFonts w:ascii="Consolas" w:hAnsi="Consolas" w:cs="Courier New"/>
-          <w:color w:val="000000"/>
-          <w:sz w:val="17"/>
-          <w:szCs w:val="17"/>
-        </w:rPr>
-        <w:t>load_sentiment_</w:t>
-      </w:r>
-      <w:proofErr w:type="gramStart"/>
-      <w:r>
-        <w:rPr>
-          <w:rFonts w:ascii="Consolas" w:hAnsi="Consolas" w:cs="Courier New"/>
-          <w:color w:val="000000"/>
-          <w:sz w:val="17"/>
-          <w:szCs w:val="17"/>
-        </w:rPr>
-        <w:t>classifier</w:t>
-      </w:r>
-      <w:proofErr w:type="spellEnd"/>
+        <w:t xml:space="preserve">        load_sentiment_classifier</w:t>
+      </w:r>
       <w:r>
         <w:rPr>
           <w:rFonts w:ascii="Consolas" w:hAnsi="Consolas" w:cs="Courier New"/>
@@ -12044,17 +10735,7 @@
           <w:sz w:val="17"/>
           <w:szCs w:val="17"/>
         </w:rPr>
-        <w:t>(</w:t>
-      </w:r>
-      <w:proofErr w:type="gramEnd"/>
-      <w:r>
-        <w:rPr>
-          <w:rFonts w:ascii="Consolas" w:hAnsi="Consolas" w:cs="Courier New"/>
-          <w:color w:val="666600"/>
-          <w:sz w:val="17"/>
-          <w:szCs w:val="17"/>
-        </w:rPr>
-        <w:t>)</w:t>
+        <w:t>()</w:t>
       </w:r>
     </w:p>
     <w:p>
@@ -12125,19 +10806,8 @@
           <w:sz w:val="17"/>
           <w:szCs w:val="17"/>
         </w:rPr>
-        <w:t xml:space="preserve"> </w:t>
-      </w:r>
-      <w:proofErr w:type="spellStart"/>
-      <w:r>
-        <w:rPr>
-          <w:rFonts w:ascii="Consolas" w:hAnsi="Consolas" w:cs="Courier New"/>
-          <w:color w:val="000000"/>
-          <w:sz w:val="17"/>
-          <w:szCs w:val="17"/>
-        </w:rPr>
-        <w:t>sentiment_model</w:t>
-      </w:r>
-      <w:proofErr w:type="spellEnd"/>
+        <w:t xml:space="preserve"> sentiment_model</w:t>
+      </w:r>
     </w:p>
     <w:p>
       <w:pPr>
@@ -12154,15 +10824,7 @@
         <w:jc w:val="left"/>
       </w:pPr>
       <w:r>
-        <w:t xml:space="preserve">3. Real-Time </w:t>
-      </w:r>
-      <w:proofErr w:type="spellStart"/>
-      <w:r>
-        <w:t>SignalR</w:t>
-      </w:r>
-      <w:proofErr w:type="spellEnd"/>
-      <w:r>
-        <w:t xml:space="preserve"> Memory Optimization</w:t>
+        <w:t>3. Real-Time SignalR Memory Optimization</w:t>
       </w:r>
     </w:p>
     <w:p>
@@ -12171,15 +10833,7 @@
         <w:jc w:val="left"/>
       </w:pPr>
       <w:r>
-        <w:t xml:space="preserve">In typical </w:t>
-      </w:r>
-      <w:proofErr w:type="spellStart"/>
-      <w:r>
-        <w:t>SignalR</w:t>
-      </w:r>
-      <w:proofErr w:type="spellEnd"/>
-      <w:r>
-        <w:t xml:space="preserve"> setups, tracking when users connect and disconnect to update store listing counts requires constant updates to the database. To protect the database from connection floods, a thread-safe static dictionary mapping was implemented in the:</w:t>
+        <w:t>In typical SignalR setups, tracking when users connect and disconnect to update store listing counts requires constant updates to the database. To protect the database from connection floods, a thread-safe static dictionary mapping was implemented in the:</w:t>
       </w:r>
     </w:p>
     <w:p>
@@ -12261,7 +10915,6 @@
         </w:rPr>
         <w:t xml:space="preserve"> </w:t>
       </w:r>
-      <w:proofErr w:type="spellStart"/>
       <w:r>
         <w:rPr>
           <w:rFonts w:ascii="Consolas" w:hAnsi="Consolas" w:cs="Courier New"/>
@@ -12271,7 +10924,6 @@
         </w:rPr>
         <w:t>readonly</w:t>
       </w:r>
-      <w:proofErr w:type="spellEnd"/>
       <w:r>
         <w:rPr>
           <w:rFonts w:ascii="Consolas" w:hAnsi="Consolas" w:cs="Courier New"/>
@@ -12353,7 +11005,6 @@
         </w:rPr>
         <w:t xml:space="preserve"> </w:t>
       </w:r>
-      <w:proofErr w:type="spellStart"/>
       <w:r>
         <w:rPr>
           <w:rFonts w:ascii="Consolas" w:hAnsi="Consolas" w:cs="Courier New"/>
@@ -12363,7 +11014,6 @@
         </w:rPr>
         <w:t>OnlineUsers</w:t>
       </w:r>
-      <w:proofErr w:type="spellEnd"/>
       <w:r>
         <w:rPr>
           <w:rFonts w:ascii="Consolas" w:hAnsi="Consolas" w:cs="Courier New"/>
@@ -12391,7 +11041,6 @@
         </w:rPr>
         <w:t xml:space="preserve"> </w:t>
       </w:r>
-      <w:proofErr w:type="gramStart"/>
       <w:r>
         <w:rPr>
           <w:rFonts w:ascii="Consolas" w:hAnsi="Consolas" w:cs="Courier New"/>
@@ -12408,17 +11057,7 @@
           <w:sz w:val="17"/>
           <w:szCs w:val="17"/>
         </w:rPr>
-        <w:t>(</w:t>
-      </w:r>
-      <w:proofErr w:type="gramEnd"/>
-      <w:r>
-        <w:rPr>
-          <w:rFonts w:ascii="Consolas" w:hAnsi="Consolas" w:cs="Courier New"/>
-          <w:color w:val="666600"/>
-          <w:sz w:val="17"/>
-          <w:szCs w:val="17"/>
-        </w:rPr>
-        <w:t>);</w:t>
+        <w:t>();</w:t>
       </w:r>
     </w:p>
     <w:p>
@@ -12581,28 +11220,7 @@
         <w:t>Target Framework:</w:t>
       </w:r>
       <w:r>
-        <w:t> </w:t>
-      </w:r>
-      <w:proofErr w:type="spellStart"/>
-      <w:r>
-        <w:t>flutter_test</w:t>
-      </w:r>
-      <w:proofErr w:type="spellEnd"/>
-      <w:r>
-        <w:t> for widget/utility assertions, </w:t>
-      </w:r>
-      <w:proofErr w:type="spellStart"/>
-      <w:proofErr w:type="gramStart"/>
-      <w:r>
-        <w:t>bloc</w:t>
-      </w:r>
-      <w:proofErr w:type="gramEnd"/>
-      <w:r>
-        <w:t>_test</w:t>
-      </w:r>
-      <w:proofErr w:type="spellEnd"/>
-      <w:r>
-        <w:t> for Cubit state management sequences, and mocktail for dependency mocking.</w:t>
+        <w:t> flutter_test for widget/utility assertions, bloc_test for Cubit state management sequences, and mocktail for dependency mocking.</w:t>
       </w:r>
     </w:p>
     <w:p>
@@ -12648,38 +11266,9 @@
         </w:numPr>
         <w:spacing w:line="278" w:lineRule="auto"/>
       </w:pPr>
-      <w:proofErr w:type="spellStart"/>
       <w:r>
         <w:lastRenderedPageBreak/>
-        <w:t>LocalizationCubit</w:t>
-      </w:r>
-      <w:proofErr w:type="spellEnd"/>
-      <w:r>
-        <w:t>: Verifies that language codes default to '</w:t>
-      </w:r>
-      <w:proofErr w:type="spellStart"/>
-      <w:r>
-        <w:t>en</w:t>
-      </w:r>
-      <w:proofErr w:type="spellEnd"/>
-      <w:r>
-        <w:t>', load properly from local settings (</w:t>
-      </w:r>
-      <w:proofErr w:type="spellStart"/>
-      <w:r>
-        <w:t>PrefsService</w:t>
-      </w:r>
-      <w:proofErr w:type="spellEnd"/>
-      <w:r>
-        <w:t>), and persist correctly upon language updates (</w:t>
-      </w:r>
-      <w:proofErr w:type="spellStart"/>
-      <w:r>
-        <w:t>LocalizationChanged</w:t>
-      </w:r>
-      <w:proofErr w:type="spellEnd"/>
-      <w:r>
-        <w:t>).</w:t>
+        <w:t>LocalizationCubit: Verifies that language codes default to 'en', load properly from local settings (PrefsService), and persist correctly upon language updates (LocalizationChanged).</w:t>
       </w:r>
     </w:p>
     <w:p>
@@ -12690,13 +11279,8 @@
         </w:numPr>
         <w:spacing w:line="278" w:lineRule="auto"/>
       </w:pPr>
-      <w:proofErr w:type="spellStart"/>
-      <w:r>
-        <w:t>ThemeCubit</w:t>
-      </w:r>
-      <w:proofErr w:type="spellEnd"/>
-      <w:r>
-        <w:t>: Asserts that theme switches change state values and persist selections.</w:t>
+      <w:r>
+        <w:t>ThemeCubit: Asserts that theme switches change state values and persist selections.</w:t>
       </w:r>
     </w:p>
     <w:p>
@@ -12707,13 +11291,8 @@
         </w:numPr>
         <w:spacing w:line="278" w:lineRule="auto"/>
       </w:pPr>
-      <w:proofErr w:type="spellStart"/>
-      <w:r>
-        <w:t>LoginCubit</w:t>
-      </w:r>
-      <w:proofErr w:type="spellEnd"/>
-      <w:r>
-        <w:t>: Validates that entering valid credentials triggers onboarding, and that login errors are handled elegantly.</w:t>
+      <w:r>
+        <w:t>LoginCubit: Validates that entering valid credentials triggers onboarding, and that login errors are handled elegantly.</w:t>
       </w:r>
     </w:p>
     <w:p>
@@ -12724,21 +11303,8 @@
         </w:numPr>
         <w:spacing w:line="278" w:lineRule="auto"/>
       </w:pPr>
-      <w:proofErr w:type="spellStart"/>
-      <w:r>
-        <w:t>GetProductsCubit</w:t>
-      </w:r>
-      <w:proofErr w:type="spellEnd"/>
-      <w:r>
-        <w:t> &amp; </w:t>
-      </w:r>
-      <w:proofErr w:type="spellStart"/>
-      <w:r>
-        <w:t>ReserveOrderCubit</w:t>
-      </w:r>
-      <w:proofErr w:type="spellEnd"/>
-      <w:r>
-        <w:t>: Asserts proper progression of loading, success, and error states when listing or ordering products.</w:t>
+      <w:r>
+        <w:t>GetProductsCubit &amp; ReserveOrderCubit: Asserts proper progression of loading, success, and error states when listing or ordering products.</w:t>
       </w:r>
     </w:p>
     <w:p>
@@ -12749,13 +11315,8 @@
         </w:numPr>
         <w:spacing w:line="278" w:lineRule="auto"/>
       </w:pPr>
-      <w:proofErr w:type="spellStart"/>
-      <w:r>
-        <w:t>OnboardingCubit</w:t>
-      </w:r>
-      <w:proofErr w:type="spellEnd"/>
-      <w:r>
-        <w:t>: Validates onboarding navigation page transitions.</w:t>
+      <w:r>
+        <w:t>OnboardingCubit: Validates onboarding navigation page transitions.</w:t>
       </w:r>
     </w:p>
     <w:p>
@@ -12782,21 +11343,8 @@
         </w:numPr>
         <w:spacing w:line="278" w:lineRule="auto"/>
       </w:pPr>
-      <w:proofErr w:type="spellStart"/>
-      <w:r>
-        <w:t>AuthRemoteDataSourceImpl</w:t>
-      </w:r>
-      <w:proofErr w:type="spellEnd"/>
-      <w:r>
-        <w:t> &amp; </w:t>
-      </w:r>
-      <w:proofErr w:type="spellStart"/>
-      <w:r>
-        <w:t>AuthRepoImpl</w:t>
-      </w:r>
-      <w:proofErr w:type="spellEnd"/>
-      <w:r>
-        <w:t>: Verifies that API interactions serialize/deserialize login, signup, email verification, and password reset requests. Uses mocktail to intercept Dio requests and verify correct parsing of standard 200 responses as well as bad request and connection timeout failures.</w:t>
+      <w:r>
+        <w:t>AuthRemoteDataSourceImpl &amp; AuthRepoImpl: Verifies that API interactions serialize/deserialize login, signup, email verification, and password reset requests. Uses mocktail to intercept Dio requests and verify correct parsing of standard 200 responses as well as bad request and connection timeout failures.</w:t>
       </w:r>
     </w:p>
     <w:p>
@@ -12823,13 +11371,8 @@
         </w:numPr>
         <w:spacing w:line="278" w:lineRule="auto"/>
       </w:pPr>
-      <w:proofErr w:type="spellStart"/>
-      <w:r>
-        <w:t>AppRegex</w:t>
-      </w:r>
-      <w:proofErr w:type="spellEnd"/>
-      <w:r>
-        <w:t>: Validates the regular expression logic for email addresses, Egyptian phone numbers, and names.</w:t>
+      <w:r>
+        <w:t>AppRegex: Validates the regular expression logic for email addresses, Egyptian phone numbers, and names.</w:t>
       </w:r>
     </w:p>
     <w:p>
@@ -12840,13 +11383,8 @@
         </w:numPr>
         <w:spacing w:line="278" w:lineRule="auto"/>
       </w:pPr>
-      <w:proofErr w:type="spellStart"/>
-      <w:r>
-        <w:t>ServerFailure</w:t>
-      </w:r>
-      <w:proofErr w:type="spellEnd"/>
-      <w:r>
-        <w:t>: Confirms that HTTP bad responses and connection exceptions map into user-friendly error messages.</w:t>
+      <w:r>
+        <w:t>ServerFailure: Confirms that HTTP bad responses and connection exceptions map into user-friendly error messages.</w:t>
       </w:r>
     </w:p>
     <w:p>
@@ -12857,13 +11395,8 @@
         </w:numPr>
         <w:spacing w:line="278" w:lineRule="auto"/>
       </w:pPr>
-      <w:proofErr w:type="spellStart"/>
-      <w:r>
-        <w:t>calculateDistance</w:t>
-      </w:r>
-      <w:proofErr w:type="spellEnd"/>
-      <w:r>
-        <w:t>: Verifies the Haversine formula calculation for finding the exact physical distance between user geolocations and merchant pins.</w:t>
+      <w:r>
+        <w:t>calculateDistance: Verifies the Haversine formula calculation for finding the exact physical distance between user geolocations and merchant pins.</w:t>
       </w:r>
     </w:p>
     <w:p>
@@ -12874,29 +11407,8 @@
         </w:numPr>
         <w:spacing w:line="278" w:lineRule="auto"/>
       </w:pPr>
-      <w:proofErr w:type="spellStart"/>
-      <w:r>
-        <w:t>formatPickupTime</w:t>
-      </w:r>
-      <w:proofErr w:type="spellEnd"/>
-      <w:r>
-        <w:t>, </w:t>
-      </w:r>
-      <w:proofErr w:type="spellStart"/>
-      <w:r>
-        <w:t>orderStatusMapper</w:t>
-      </w:r>
-      <w:proofErr w:type="spellEnd"/>
-      <w:r>
-        <w:t>, and </w:t>
-      </w:r>
-      <w:proofErr w:type="spellStart"/>
-      <w:r>
-        <w:t>uiMappers</w:t>
-      </w:r>
-      <w:proofErr w:type="spellEnd"/>
-      <w:r>
-        <w:t>: Checks formatting, status mapping, and model conversions.</w:t>
+      <w:r>
+        <w:t>formatPickupTime, orderStatusMapper, and uiMappers: Checks formatting, status mapping, and model conversions.</w:t>
       </w:r>
     </w:p>
     <w:p>
@@ -12980,15 +11492,7 @@
         <w:t>Swagger UI</w:t>
       </w:r>
       <w:r>
-        <w:t> (</w:t>
-      </w:r>
-      <w:proofErr w:type="spellStart"/>
-      <w:r>
-        <w:t>Swashbuckle</w:t>
-      </w:r>
-      <w:proofErr w:type="spellEnd"/>
-      <w:r>
-        <w:t>) and a Visual Studio Code </w:t>
+        <w:t> (Swashbuckle) and a Visual Studio Code </w:t>
       </w:r>
       <w:r>
         <w:rPr>
@@ -12998,15 +11502,7 @@
         <w:t>REST Client</w:t>
       </w:r>
       <w:r>
-        <w:t> (</w:t>
-      </w:r>
-      <w:proofErr w:type="spellStart"/>
-      <w:r>
-        <w:t>FoodRescue.PL.http</w:t>
-      </w:r>
-      <w:proofErr w:type="spellEnd"/>
-      <w:r>
-        <w:t>).</w:t>
+        <w:t> (FoodRescue.PL.http).</w:t>
       </w:r>
     </w:p>
     <w:p>
@@ -13025,23 +11521,7 @@
         <w:t>Test Case Example (JWT Refresh Token Lifecycle):</w:t>
       </w:r>
       <w:r>
-        <w:t xml:space="preserve"> A script issues a request with an expired access token to a protected endpoint. It verifies that the API returns HTTP 401 Unauthorized. The script then requests /auth/refresh-token with the refresh token. It </w:t>
-      </w:r>
-      <w:proofErr w:type="gramStart"/>
-      <w:r>
-        <w:t>validates</w:t>
-      </w:r>
-      <w:proofErr w:type="gramEnd"/>
-      <w:r>
-        <w:t xml:space="preserve"> that the response contains HTTP 200 OK alongside a new rotated access token, allowing the original request to be </w:t>
-      </w:r>
-      <w:proofErr w:type="gramStart"/>
-      <w:r>
-        <w:t>re-sent</w:t>
-      </w:r>
-      <w:proofErr w:type="gramEnd"/>
-      <w:r>
-        <w:t xml:space="preserve"> and succeed.</w:t>
+        <w:t> A script issues a request with an expired access token to a protected endpoint. It verifies that the API returns HTTP 401 Unauthorized. The script then requests /auth/refresh-token with the refresh token. It validates that the response contains HTTP 200 OK alongside a new rotated access token, allowing the original request to be re-sent and succeed.</w:t>
       </w:r>
     </w:p>
     <w:p>
@@ -13060,23 +11540,7 @@
         <w:t>Database Constraints:</w:t>
       </w:r>
       <w:r>
-        <w:t> Verified database transactions and key constraints in SQL Server via Entity Framework migrations. For example, testing cascading delete limits on entities: deleting a user must trigger the removal of their active refresh tokens, but reports submitted by that user are retained as anonymous records by using </w:t>
-      </w:r>
-      <w:proofErr w:type="spellStart"/>
-      <w:r>
-        <w:t>DeleteBehavior.Restrict</w:t>
-      </w:r>
-      <w:proofErr w:type="spellEnd"/>
-      <w:r>
-        <w:t> or </w:t>
-      </w:r>
-      <w:proofErr w:type="spellStart"/>
-      <w:r>
-        <w:t>DeleteBehavior.SetNull</w:t>
-      </w:r>
-      <w:proofErr w:type="spellEnd"/>
-      <w:r>
-        <w:t> to prevent database inconsistency.</w:t>
+        <w:t> Verified database transactions and key constraints in SQL Server via Entity Framework migrations. For example, testing cascading delete limits on entities: deleting a user must trigger the removal of their active refresh tokens, but reports submitted by that user are retained as anonymous records by using DeleteBehavior.Restrict or DeleteBehavior.SetNull to prevent database inconsistency.</w:t>
       </w:r>
     </w:p>
     <w:p>
@@ -13092,15 +11556,7 @@
         <w:spacing w:line="278" w:lineRule="auto"/>
       </w:pPr>
       <w:r>
-        <w:t xml:space="preserve">The </w:t>
-      </w:r>
-      <w:proofErr w:type="spellStart"/>
-      <w:r>
-        <w:t>FastAPI</w:t>
-      </w:r>
-      <w:proofErr w:type="spellEnd"/>
-      <w:r>
-        <w:t xml:space="preserve"> AI service was tested using an integration script (test_api.py):</w:t>
+        <w:t>The FastAPI AI service was tested using an integration script (test_api.py):</w:t>
       </w:r>
     </w:p>
     <w:p>
@@ -13119,31 +11575,7 @@
         <w:t>Image Prediction route (/predict):</w:t>
       </w:r>
       <w:r>
-        <w:t xml:space="preserve"> The script uploads sample fresh and spoiled images via multipart form data, verifying that the </w:t>
-      </w:r>
-      <w:proofErr w:type="spellStart"/>
-      <w:r>
-        <w:t>FastAPI</w:t>
-      </w:r>
-      <w:proofErr w:type="spellEnd"/>
-      <w:r>
-        <w:t xml:space="preserve"> server successfully executes ONNX sessions and returns JSON payloads containing the predicted label, confidence, and a </w:t>
-      </w:r>
-      <w:proofErr w:type="spellStart"/>
-      <w:r>
-        <w:t>boolean</w:t>
-      </w:r>
-      <w:proofErr w:type="spellEnd"/>
-      <w:r>
-        <w:t> </w:t>
-      </w:r>
-      <w:proofErr w:type="spellStart"/>
-      <w:r>
-        <w:t>is_spoiled</w:t>
-      </w:r>
-      <w:proofErr w:type="spellEnd"/>
-      <w:r>
-        <w:t> flag.</w:t>
+        <w:t> The script uploads sample fresh and spoiled images via multipart form data, verifying that the FastAPI server successfully executes ONNX sessions and returns JSON payloads containing the predicted label, confidence, and a boolean is_spoiled flag.</w:t>
       </w:r>
     </w:p>
     <w:p>
@@ -13198,15 +11630,7 @@
         <w:t>Target Framework:</w:t>
       </w:r>
       <w:r>
-        <w:t> </w:t>
-      </w:r>
-      <w:proofErr w:type="spellStart"/>
-      <w:r>
-        <w:t>integration_test</w:t>
-      </w:r>
-      <w:proofErr w:type="spellEnd"/>
-      <w:r>
-        <w:t> (Flutter's official integration test library).</w:t>
+        <w:t> integration_test (Flutter's official integration test library).</w:t>
       </w:r>
     </w:p>
     <w:p>
@@ -13225,31 +11649,7 @@
         <w:t>Scope:</w:t>
       </w:r>
       <w:r>
-        <w:t> Automated interface widget and router integration tests executed in mobile/</w:t>
-      </w:r>
-      <w:proofErr w:type="spellStart"/>
-      <w:r>
-        <w:t>food_rescue_app</w:t>
-      </w:r>
-      <w:proofErr w:type="spellEnd"/>
-      <w:r>
-        <w:t>/</w:t>
-      </w:r>
-      <w:proofErr w:type="spellStart"/>
-      <w:r>
-        <w:t>integration_test</w:t>
-      </w:r>
-      <w:proofErr w:type="spellEnd"/>
-      <w:r>
-        <w:t>/</w:t>
-      </w:r>
-      <w:proofErr w:type="spellStart"/>
-      <w:r>
-        <w:t>app_test.dart</w:t>
-      </w:r>
-      <w:proofErr w:type="spellEnd"/>
-      <w:r>
-        <w:t>.</w:t>
+        <w:t> Automated interface widget and router integration tests executed in mobile/food_rescue_app/integration_test/app_test.dart.</w:t>
       </w:r>
     </w:p>
     <w:p>
@@ -13285,15 +11685,7 @@
         <w:t>Splash Display &amp; Timeout:</w:t>
       </w:r>
       <w:r>
-        <w:t> Verifies that launching the app presents the brand text elements (Waste, 2, Taste). Simulates a virtual clock advance of 4 seconds to ensure the router correctly shifts to the </w:t>
-      </w:r>
-      <w:proofErr w:type="spellStart"/>
-      <w:r>
-        <w:t>OnboardingView</w:t>
-      </w:r>
-      <w:proofErr w:type="spellEnd"/>
-      <w:r>
-        <w:t>.</w:t>
+        <w:t> Verifies that launching the app presents the brand text elements (Waste, 2, Taste). Simulates a virtual clock advance of 4 seconds to ensure the router correctly shifts to the OnboardingView.</w:t>
       </w:r>
     </w:p>
     <w:p>
@@ -13312,23 +11704,7 @@
         <w:t>Onboarding Navigation:</w:t>
       </w:r>
       <w:r>
-        <w:t xml:space="preserve"> Taps the </w:t>
-      </w:r>
-      <w:proofErr w:type="gramStart"/>
-      <w:r>
-        <w:t>onboarding next</w:t>
-      </w:r>
-      <w:proofErr w:type="gramEnd"/>
-      <w:r>
-        <w:t xml:space="preserve"> button twice and then clicks "Get Started" to ensure smooth transitions through onboarding slides to the </w:t>
-      </w:r>
-      <w:proofErr w:type="spellStart"/>
-      <w:r>
-        <w:t>LoginView</w:t>
-      </w:r>
-      <w:proofErr w:type="spellEnd"/>
-      <w:r>
-        <w:t>.</w:t>
+        <w:t> Taps the onboarding next button twice and then clicks "Get Started" to ensure smooth transitions through onboarding slides to the LoginView.</w:t>
       </w:r>
     </w:p>
     <w:p>
@@ -13347,15 +11723,7 @@
         <w:t>Login Form Validation:</w:t>
       </w:r>
       <w:r>
-        <w:t> Enters invalid email addresses and empty fields, clicks the login button, and verifies that the </w:t>
-      </w:r>
-      <w:proofErr w:type="spellStart"/>
-      <w:r>
-        <w:t>CustomTextFormField</w:t>
-      </w:r>
-      <w:proofErr w:type="spellEnd"/>
-      <w:r>
-        <w:t> displays the correct local validation error state.</w:t>
+        <w:t> Enters invalid email addresses and empty fields, clicks the login button, and verifies that the CustomTextFormField displays the correct local validation error state.</w:t>
       </w:r>
     </w:p>
     <w:p>
@@ -13386,15 +11754,7 @@
         <w:spacing w:line="278" w:lineRule="auto"/>
       </w:pPr>
       <w:r>
-        <w:t>Unauthenticated users trying to access the home screen (/</w:t>
-      </w:r>
-      <w:proofErr w:type="spellStart"/>
-      <w:r>
-        <w:t>homeNavigationBar</w:t>
-      </w:r>
-      <w:proofErr w:type="spellEnd"/>
-      <w:r>
-        <w:t>) are forcefully redirected to /login.</w:t>
+        <w:t>Unauthenticated users trying to access the home screen (/homeNavigationBar) are forcefully redirected to /login.</w:t>
       </w:r>
     </w:p>
     <w:p>
@@ -13406,15 +11766,7 @@
         <w:spacing w:line="278" w:lineRule="auto"/>
       </w:pPr>
       <w:r>
-        <w:t>Authenticated users trying to access /login are automatically bypassed and forwarded to /</w:t>
-      </w:r>
-      <w:proofErr w:type="spellStart"/>
-      <w:r>
-        <w:t>homeNavigationBar</w:t>
-      </w:r>
-      <w:proofErr w:type="spellEnd"/>
-      <w:r>
-        <w:t>.</w:t>
+        <w:t>Authenticated users trying to access /login are automatically bypassed and forwarded to /homeNavigationBar.</w:t>
       </w:r>
     </w:p>
     <w:p>
@@ -13433,31 +11785,7 @@
         <w:t>Preferences Interaction:</w:t>
       </w:r>
       <w:r>
-        <w:t> Exercises the theme and language cubits. Validates that changing language emits </w:t>
-      </w:r>
-      <w:proofErr w:type="spellStart"/>
-      <w:r>
-        <w:t>LocalizationChanged</w:t>
-      </w:r>
-      <w:proofErr w:type="spellEnd"/>
-      <w:r>
-        <w:t> with the correct '</w:t>
-      </w:r>
-      <w:proofErr w:type="spellStart"/>
-      <w:r>
-        <w:t>ar</w:t>
-      </w:r>
-      <w:proofErr w:type="spellEnd"/>
-      <w:r>
-        <w:t>' or '</w:t>
-      </w:r>
-      <w:proofErr w:type="spellStart"/>
-      <w:r>
-        <w:t>en</w:t>
-      </w:r>
-      <w:proofErr w:type="spellEnd"/>
-      <w:r>
-        <w:t>' codes, and toggling the theme successfully switches the system mode.</w:t>
+        <w:t> Exercises the theme and language cubits. Validates that changing language emits LocalizationChanged with the correct 'ar' or 'en' codes, and toggling the theme successfully switches the system mode.</w:t>
       </w:r>
     </w:p>
     <w:p>
@@ -13538,23 +11866,7 @@
         <w:t>Auth Requests Serialization:</w:t>
       </w:r>
       <w:r>
-        <w:t> Asserts that signup, login, </w:t>
-      </w:r>
-      <w:proofErr w:type="spellStart"/>
-      <w:r>
-        <w:t>verifyEmail</w:t>
-      </w:r>
-      <w:proofErr w:type="spellEnd"/>
-      <w:r>
-        <w:t>, and </w:t>
-      </w:r>
-      <w:proofErr w:type="spellStart"/>
-      <w:r>
-        <w:t>resetPassword</w:t>
-      </w:r>
-      <w:proofErr w:type="spellEnd"/>
-      <w:r>
-        <w:t> operations serialize query model fields correctly, send requests, and map response payloads into system entities on HTTP 200 responses.</w:t>
+        <w:t> Asserts that signup, login, verifyEmail, and resetPassword operations serialize query model fields correctly, send requests, and map response payloads into system entities on HTTP 200 responses.</w:t>
       </w:r>
     </w:p>
     <w:p>
@@ -13573,15 +11885,7 @@
         <w:t>Security Token Persistence:</w:t>
       </w:r>
       <w:r>
-        <w:t> Asserts that on successful login, the app interacts with </w:t>
-      </w:r>
-      <w:proofErr w:type="spellStart"/>
-      <w:r>
-        <w:t>FlutterSecureStorageService</w:t>
-      </w:r>
-      <w:proofErr w:type="spellEnd"/>
-      <w:r>
-        <w:t> to securely save rotated JSON Web Tokens (JWT) locally.</w:t>
+        <w:t> Asserts that on successful login, the app interacts with FlutterSecureStorageService to securely save rotated JSON Web Tokens (JWT) locally.</w:t>
       </w:r>
     </w:p>
     <w:p>
@@ -13600,15 +11904,7 @@
         <w:t>Dio Error Mapping:</w:t>
       </w:r>
       <w:r>
-        <w:t> Intercepts network exceptions (e.g., connection timeouts, bad API responses like 400 Bad Request) to verify they translate correctly to </w:t>
-      </w:r>
-      <w:proofErr w:type="spellStart"/>
-      <w:r>
-        <w:t>ServerFailure</w:t>
-      </w:r>
-      <w:proofErr w:type="spellEnd"/>
-      <w:r>
-        <w:t> structures with user-facing warnings.</w:t>
+        <w:t> Intercepts network exceptions (e.g., connection timeouts, bad API responses like 400 Bad Request) to verify they translate correctly to ServerFailure structures with user-facing warnings.</w:t>
       </w:r>
     </w:p>
     <w:p>
@@ -13871,15 +12167,7 @@
               <w:cnfStyle w:val="000000000000" w:firstRow="0" w:lastRow="0" w:firstColumn="0" w:lastColumn="0" w:oddVBand="0" w:evenVBand="0" w:oddHBand="0" w:evenHBand="0" w:firstRowFirstColumn="0" w:firstRowLastColumn="0" w:lastRowFirstColumn="0" w:lastRowLastColumn="0"/>
             </w:pPr>
             <w:r>
-              <w:t xml:space="preserve">Vendor status changes to Approved &amp; map pin </w:t>
-            </w:r>
-            <w:proofErr w:type="gramStart"/>
-            <w:r>
-              <w:t>is</w:t>
-            </w:r>
-            <w:proofErr w:type="gramEnd"/>
-            <w:r>
-              <w:t xml:space="preserve"> activated.</w:t>
+              <w:t>Vendor status changes to Approved &amp; map pin is activated.</w:t>
             </w:r>
           </w:p>
         </w:tc>
@@ -14036,15 +12324,7 @@
               <w:cnfStyle w:val="000000000000" w:firstRow="0" w:lastRow="0" w:firstColumn="0" w:lastColumn="0" w:oddVBand="0" w:evenVBand="0" w:oddHBand="0" w:evenHBand="0" w:firstRowFirstColumn="0" w:firstRowLastColumn="0" w:lastRowFirstColumn="0" w:lastRowLastColumn="0"/>
             </w:pPr>
             <w:r>
-              <w:t>Order changes to </w:t>
-            </w:r>
-            <w:proofErr w:type="gramStart"/>
-            <w:r>
-              <w:t>Completed</w:t>
-            </w:r>
-            <w:proofErr w:type="gramEnd"/>
-            <w:r>
-              <w:t>; merchant dashboard updates.</w:t>
+              <w:t>Order changes to Completed; merchant dashboard updates.</w:t>
             </w:r>
           </w:p>
         </w:tc>
@@ -14588,21 +12868,12 @@
             <w:pPr>
               <w:spacing w:after="160" w:line="278" w:lineRule="auto"/>
             </w:pPr>
-            <w:proofErr w:type="gramStart"/>
             <w:r>
               <w:rPr>
                 <w:b/>
                 <w:bCs/>
               </w:rPr>
-              <w:t>Produce</w:t>
-            </w:r>
-            <w:proofErr w:type="gramEnd"/>
-            <w:r>
-              <w:rPr>
-                <w:b/>
-                <w:bCs/>
-              </w:rPr>
-              <w:t xml:space="preserve"> (Fruits/Veg)</w:t>
+              <w:t>Produce (Fruits/Veg)</w:t>
             </w:r>
           </w:p>
         </w:tc>
@@ -14909,13 +13180,8 @@
               <w:cnfStyle w:val="000000100000" w:firstRow="0" w:lastRow="0" w:firstColumn="0" w:lastColumn="0" w:oddVBand="0" w:evenVBand="0" w:oddHBand="1" w:evenHBand="0" w:firstRowFirstColumn="0" w:firstRowLastColumn="0" w:lastRowFirstColumn="0" w:lastRowLastColumn="0"/>
             </w:pPr>
             <w:r>
-              <w:t xml:space="preserve">3.46 </w:t>
-            </w:r>
-            <w:proofErr w:type="spellStart"/>
-            <w:r>
-              <w:t>ms</w:t>
-            </w:r>
-            <w:proofErr w:type="spellEnd"/>
+              <w:t>3.46 ms</w:t>
+            </w:r>
           </w:p>
         </w:tc>
         <w:tc>
@@ -14929,13 +13195,8 @@
               <w:cnfStyle w:val="000000100000" w:firstRow="0" w:lastRow="0" w:firstColumn="0" w:lastColumn="0" w:oddVBand="0" w:evenVBand="0" w:oddHBand="1" w:evenHBand="0" w:firstRowFirstColumn="0" w:firstRowLastColumn="0" w:lastRowFirstColumn="0" w:lastRowLastColumn="0"/>
             </w:pPr>
             <w:r>
-              <w:t xml:space="preserve">5.30 </w:t>
-            </w:r>
-            <w:proofErr w:type="spellStart"/>
-            <w:r>
-              <w:t>ms</w:t>
-            </w:r>
-            <w:proofErr w:type="spellEnd"/>
+              <w:t>5.30 ms</w:t>
+            </w:r>
           </w:p>
         </w:tc>
         <w:tc>
@@ -15000,13 +13261,8 @@
               <w:cnfStyle w:val="000000000000" w:firstRow="0" w:lastRow="0" w:firstColumn="0" w:lastColumn="0" w:oddVBand="0" w:evenVBand="0" w:oddHBand="0" w:evenHBand="0" w:firstRowFirstColumn="0" w:firstRowLastColumn="0" w:lastRowFirstColumn="0" w:lastRowLastColumn="0"/>
             </w:pPr>
             <w:r>
-              <w:t xml:space="preserve">26.96 </w:t>
-            </w:r>
-            <w:proofErr w:type="spellStart"/>
-            <w:r>
-              <w:t>ms</w:t>
-            </w:r>
-            <w:proofErr w:type="spellEnd"/>
+              <w:t>26.96 ms</w:t>
+            </w:r>
           </w:p>
         </w:tc>
         <w:tc>
@@ -15020,13 +13276,8 @@
               <w:cnfStyle w:val="000000000000" w:firstRow="0" w:lastRow="0" w:firstColumn="0" w:lastColumn="0" w:oddVBand="0" w:evenVBand="0" w:oddHBand="0" w:evenHBand="0" w:firstRowFirstColumn="0" w:firstRowLastColumn="0" w:lastRowFirstColumn="0" w:lastRowLastColumn="0"/>
             </w:pPr>
             <w:r>
-              <w:t xml:space="preserve">46.11 </w:t>
-            </w:r>
-            <w:proofErr w:type="spellStart"/>
-            <w:r>
-              <w:t>ms</w:t>
-            </w:r>
-            <w:proofErr w:type="spellEnd"/>
+              <w:t>46.11 ms</w:t>
+            </w:r>
           </w:p>
         </w:tc>
         <w:tc>
@@ -15094,13 +13345,8 @@
               <w:cnfStyle w:val="000000100000" w:firstRow="0" w:lastRow="0" w:firstColumn="0" w:lastColumn="0" w:oddVBand="0" w:evenVBand="0" w:oddHBand="1" w:evenHBand="0" w:firstRowFirstColumn="0" w:firstRowLastColumn="0" w:lastRowFirstColumn="0" w:lastRowLastColumn="0"/>
             </w:pPr>
             <w:r>
-              <w:t xml:space="preserve">31.50 </w:t>
-            </w:r>
-            <w:proofErr w:type="spellStart"/>
-            <w:r>
-              <w:t>ms</w:t>
-            </w:r>
-            <w:proofErr w:type="spellEnd"/>
+              <w:t>31.50 ms</w:t>
+            </w:r>
           </w:p>
         </w:tc>
         <w:tc>
@@ -15114,13 +13360,8 @@
               <w:cnfStyle w:val="000000100000" w:firstRow="0" w:lastRow="0" w:firstColumn="0" w:lastColumn="0" w:oddVBand="0" w:evenVBand="0" w:oddHBand="1" w:evenHBand="0" w:firstRowFirstColumn="0" w:firstRowLastColumn="0" w:lastRowFirstColumn="0" w:lastRowLastColumn="0"/>
             </w:pPr>
             <w:r>
-              <w:t xml:space="preserve">47.17 </w:t>
-            </w:r>
-            <w:proofErr w:type="spellStart"/>
-            <w:r>
-              <w:t>ms</w:t>
-            </w:r>
-            <w:proofErr w:type="spellEnd"/>
+              <w:t>47.17 ms</w:t>
+            </w:r>
           </w:p>
         </w:tc>
         <w:tc>
@@ -15185,13 +13426,8 @@
               <w:cnfStyle w:val="000000000000" w:firstRow="0" w:lastRow="0" w:firstColumn="0" w:lastColumn="0" w:oddVBand="0" w:evenVBand="0" w:oddHBand="0" w:evenHBand="0" w:firstRowFirstColumn="0" w:firstRowLastColumn="0" w:lastRowFirstColumn="0" w:lastRowLastColumn="0"/>
             </w:pPr>
             <w:r>
-              <w:t xml:space="preserve">33.55 </w:t>
-            </w:r>
-            <w:proofErr w:type="spellStart"/>
-            <w:r>
-              <w:t>ms</w:t>
-            </w:r>
-            <w:proofErr w:type="spellEnd"/>
+              <w:t>33.55 ms</w:t>
+            </w:r>
           </w:p>
         </w:tc>
         <w:tc>
@@ -15205,13 +13441,8 @@
               <w:cnfStyle w:val="000000000000" w:firstRow="0" w:lastRow="0" w:firstColumn="0" w:lastColumn="0" w:oddVBand="0" w:evenVBand="0" w:oddHBand="0" w:evenHBand="0" w:firstRowFirstColumn="0" w:firstRowLastColumn="0" w:lastRowFirstColumn="0" w:lastRowLastColumn="0"/>
             </w:pPr>
             <w:r>
-              <w:t xml:space="preserve">45.77 </w:t>
-            </w:r>
-            <w:proofErr w:type="spellStart"/>
-            <w:r>
-              <w:t>ms</w:t>
-            </w:r>
-            <w:proofErr w:type="spellEnd"/>
+              <w:t>45.77 ms</w:t>
+            </w:r>
           </w:p>
         </w:tc>
         <w:tc>
@@ -15279,13 +13510,8 @@
               <w:cnfStyle w:val="000000100000" w:firstRow="0" w:lastRow="0" w:firstColumn="0" w:lastColumn="0" w:oddVBand="0" w:evenVBand="0" w:oddHBand="1" w:evenHBand="0" w:firstRowFirstColumn="0" w:firstRowLastColumn="0" w:lastRowFirstColumn="0" w:lastRowLastColumn="0"/>
             </w:pPr>
             <w:r>
-              <w:t xml:space="preserve">32.24 </w:t>
-            </w:r>
-            <w:proofErr w:type="spellStart"/>
-            <w:r>
-              <w:t>ms</w:t>
-            </w:r>
-            <w:proofErr w:type="spellEnd"/>
+              <w:t>32.24 ms</w:t>
+            </w:r>
           </w:p>
         </w:tc>
         <w:tc>
@@ -15299,13 +13525,8 @@
               <w:cnfStyle w:val="000000100000" w:firstRow="0" w:lastRow="0" w:firstColumn="0" w:lastColumn="0" w:oddVBand="0" w:evenVBand="0" w:oddHBand="1" w:evenHBand="0" w:firstRowFirstColumn="0" w:firstRowLastColumn="0" w:lastRowFirstColumn="0" w:lastRowLastColumn="0"/>
             </w:pPr>
             <w:r>
-              <w:t xml:space="preserve">45.66 </w:t>
-            </w:r>
-            <w:proofErr w:type="spellStart"/>
-            <w:r>
-              <w:t>ms</w:t>
-            </w:r>
-            <w:proofErr w:type="spellEnd"/>
+              <w:t>45.66 ms</w:t>
+            </w:r>
           </w:p>
         </w:tc>
         <w:tc>
@@ -15370,13 +13591,8 @@
               <w:cnfStyle w:val="000000000000" w:firstRow="0" w:lastRow="0" w:firstColumn="0" w:lastColumn="0" w:oddVBand="0" w:evenVBand="0" w:oddHBand="0" w:evenHBand="0" w:firstRowFirstColumn="0" w:firstRowLastColumn="0" w:lastRowFirstColumn="0" w:lastRowLastColumn="0"/>
             </w:pPr>
             <w:r>
-              <w:t xml:space="preserve">3.23 </w:t>
-            </w:r>
-            <w:proofErr w:type="spellStart"/>
-            <w:r>
-              <w:t>ms</w:t>
-            </w:r>
-            <w:proofErr w:type="spellEnd"/>
+              <w:t>3.23 ms</w:t>
+            </w:r>
           </w:p>
         </w:tc>
         <w:tc>
@@ -15390,13 +13606,8 @@
               <w:cnfStyle w:val="000000000000" w:firstRow="0" w:lastRow="0" w:firstColumn="0" w:lastColumn="0" w:oddVBand="0" w:evenVBand="0" w:oddHBand="0" w:evenHBand="0" w:firstRowFirstColumn="0" w:firstRowLastColumn="0" w:lastRowFirstColumn="0" w:lastRowLastColumn="0"/>
             </w:pPr>
             <w:r>
-              <w:t xml:space="preserve">4.05 </w:t>
-            </w:r>
-            <w:proofErr w:type="spellStart"/>
-            <w:r>
-              <w:t>ms</w:t>
-            </w:r>
-            <w:proofErr w:type="spellEnd"/>
+              <w:t>4.05 ms</w:t>
+            </w:r>
           </w:p>
         </w:tc>
         <w:tc>
@@ -15442,15 +13653,7 @@
         <w:spacing w:line="278" w:lineRule="auto"/>
       </w:pPr>
       <w:r>
-        <w:t xml:space="preserve">The platform utilizes natural language processing (NLP) to parse customer review text and flag negative experiences or sanitation hazards (e.g., rotten food) for immediate </w:t>
-      </w:r>
-      <w:proofErr w:type="gramStart"/>
-      <w:r>
-        <w:t>administrator</w:t>
-      </w:r>
-      <w:proofErr w:type="gramEnd"/>
-      <w:r>
-        <w:t xml:space="preserve"> attention.</w:t>
+        <w:t>The platform utilizes natural language processing (NLP) to parse customer review text and flag negative experiences or sanitation hazards (e.g., rotten food) for immediate administrator attention.</w:t>
       </w:r>
     </w:p>
     <w:p>
@@ -15530,32 +13733,15 @@
         <w:t>Inference Speed</w:t>
       </w:r>
       <w:r>
-        <w:t xml:space="preserve">: The average inference latency dropped from 681.57 </w:t>
-      </w:r>
-      <w:proofErr w:type="spellStart"/>
-      <w:r>
-        <w:t>ms</w:t>
-      </w:r>
-      <w:proofErr w:type="spellEnd"/>
-      <w:r>
-        <w:t xml:space="preserve"> to </w:t>
+        <w:t>: The average inference latency dropped from 681.57 ms to </w:t>
       </w:r>
       <w:r>
         <w:rPr>
           <w:b/>
           <w:bCs/>
         </w:rPr>
-        <w:t xml:space="preserve">56.62 </w:t>
-      </w:r>
-      <w:proofErr w:type="spellStart"/>
-      <w:r>
-        <w:rPr>
-          <w:b/>
-          <w:bCs/>
-        </w:rPr>
-        <w:t>ms</w:t>
-      </w:r>
-      <w:proofErr w:type="spellEnd"/>
+        <w:t>56.62 ms</w:t>
+      </w:r>
       <w:r>
         <w:t>, resulting in a </w:t>
       </w:r>
@@ -15593,17 +13779,8 @@
           <w:b/>
           <w:bCs/>
         </w:rPr>
-        <w:t xml:space="preserve">127.61 </w:t>
-      </w:r>
-      <w:proofErr w:type="spellStart"/>
-      <w:r>
-        <w:rPr>
-          <w:b/>
-          <w:bCs/>
-        </w:rPr>
-        <w:t>ms</w:t>
-      </w:r>
-      <w:proofErr w:type="spellEnd"/>
+        <w:t>127.61 ms</w:t>
+      </w:r>
       <w:r>
         <w:t> (</w:t>
       </w:r>
@@ -15655,15 +13832,7 @@
         <w:t>Accuracy Trade-off</w:t>
       </w:r>
       <w:r>
-        <w:t xml:space="preserve">: Zero-shot multi-label </w:t>
-      </w:r>
-      <w:proofErr w:type="gramStart"/>
-      <w:r>
-        <w:t>top-1</w:t>
-      </w:r>
-      <w:proofErr w:type="gramEnd"/>
-      <w:r>
-        <w:t xml:space="preserve"> classification accuracy decreased slightly from 58.3% to </w:t>
+        <w:t>: Zero-shot multi-label top-1 classification accuracy decreased slightly from 58.3% to </w:t>
       </w:r>
       <w:r>
         <w:rPr>
@@ -15989,15 +14158,7 @@
               <w:spacing w:after="160"/>
             </w:pPr>
             <w:r>
-              <w:t xml:space="preserve">"I showed up at the </w:t>
-            </w:r>
-            <w:proofErr w:type="gramStart"/>
-            <w:r>
-              <w:t>store</w:t>
-            </w:r>
-            <w:proofErr w:type="gramEnd"/>
-            <w:r>
-              <w:t xml:space="preserve"> but it was already closed, very frustrating."</w:t>
+              <w:t>"I showed up at the store but it was already closed, very frustrating."</w:t>
             </w:r>
           </w:p>
         </w:tc>
@@ -16357,15 +14518,7 @@
     </w:p>
     <w:p>
       <w:r>
-        <w:t xml:space="preserve">To assess the competitive positioning of Waste2Taste, a comparative matrix was compiled against prominent global platforms (Too Good </w:t>
-      </w:r>
-      <w:proofErr w:type="gramStart"/>
-      <w:r>
-        <w:t>To</w:t>
-      </w:r>
-      <w:proofErr w:type="gramEnd"/>
-      <w:r>
-        <w:t xml:space="preserve"> Go, Karma, Olio) and local models in the Middle East</w:t>
+        <w:t>To assess the competitive positioning of Waste2Taste, a comparative matrix was compiled against prominent global platforms (Too Good To Go, Karma, Olio) and local models in the Middle East</w:t>
       </w:r>
       <w:r>
         <w:t>.</w:t>
@@ -16473,14 +14626,12 @@
             <w:r>
               <w:t>Waste2Taste</w:t>
             </w:r>
-            <w:proofErr w:type="gramStart"/>
             <w:r>
               <w:t xml:space="preserve"> </w:t>
             </w:r>
             <w:r>
               <w:t xml:space="preserve">  (</w:t>
             </w:r>
-            <w:proofErr w:type="gramEnd"/>
             <w:r>
               <w:t>OUR SOLUTION)</w:t>
             </w:r>
@@ -16901,37 +15052,12 @@
               <w:spacing w:after="160"/>
               <w:cnfStyle w:val="000000100000" w:firstRow="0" w:lastRow="0" w:firstColumn="0" w:lastColumn="0" w:oddVBand="0" w:evenVBand="0" w:oddHBand="1" w:evenHBand="0" w:firstRowFirstColumn="0" w:firstRowLastColumn="0" w:lastRowFirstColumn="0" w:lastRowLastColumn="0"/>
             </w:pPr>
-            <w:proofErr w:type="spellStart"/>
             <w:r>
               <w:rPr>
                 <w:b/>
                 <w:bCs/>
               </w:rPr>
-              <w:t>SignalR</w:t>
-            </w:r>
-            <w:proofErr w:type="spellEnd"/>
-            <w:r>
-              <w:rPr>
-                <w:b/>
-                <w:bCs/>
-              </w:rPr>
-              <w:t xml:space="preserve"> </w:t>
-            </w:r>
-            <w:proofErr w:type="spellStart"/>
-            <w:r>
-              <w:rPr>
-                <w:b/>
-                <w:bCs/>
-              </w:rPr>
-              <w:t>WebSockets</w:t>
-            </w:r>
-            <w:proofErr w:type="spellEnd"/>
-            <w:r>
-              <w:rPr>
-                <w:b/>
-                <w:bCs/>
-              </w:rPr>
-              <w:t xml:space="preserve"> connection mapping</w:t>
+              <w:t>SignalR WebSockets connection mapping</w:t>
             </w:r>
           </w:p>
         </w:tc>
@@ -17149,15 +15275,7 @@
         <w:t>Integrated Charity Donation Pipeline:</w:t>
       </w:r>
       <w:r>
-        <w:t xml:space="preserve"> While platforms like Olio are peer-to-peer and Too Good </w:t>
-      </w:r>
-      <w:proofErr w:type="gramStart"/>
-      <w:r>
-        <w:t>To</w:t>
-      </w:r>
-      <w:proofErr w:type="gramEnd"/>
-      <w:r>
-        <w:t xml:space="preserve"> Go is commercial, Waste2Taste combines commercial surplus food sales with a </w:t>
+        <w:t> While platforms like Olio are peer-to-peer and Too Good To Go is commercial, Waste2Taste combines commercial surplus food sales with a </w:t>
       </w:r>
       <w:r>
         <w:rPr>
@@ -17244,23 +15362,7 @@
         <w:t>System Operability:</w:t>
       </w:r>
       <w:r>
-        <w:t xml:space="preserve"> A fully operational multi-tier system was successfully deployed, comprising a Python </w:t>
-      </w:r>
-      <w:proofErr w:type="spellStart"/>
-      <w:r>
-        <w:t>FastAPI</w:t>
-      </w:r>
-      <w:proofErr w:type="spellEnd"/>
-      <w:r>
-        <w:t xml:space="preserve"> AI service on Railway, an ASP.NET Core REST API, a React 18 web administration panel on </w:t>
-      </w:r>
-      <w:proofErr w:type="spellStart"/>
-      <w:r>
-        <w:t>Vercel</w:t>
-      </w:r>
-      <w:proofErr w:type="spellEnd"/>
-      <w:r>
-        <w:t>, and a cross-platform Flutter mobile application.</w:t>
+        <w:t> A fully operational multi-tier system was successfully deployed, comprising a Python FastAPI AI service on Railway, an ASP.NET Core REST API, a React 18 web administration panel on Vercel, and a cross-platform Flutter mobile application.</w:t>
       </w:r>
     </w:p>
     <w:p>
@@ -17295,17 +15397,8 @@
           <w:b/>
           <w:bCs/>
         </w:rPr>
-        <w:t xml:space="preserve">34 </w:t>
-      </w:r>
-      <w:proofErr w:type="spellStart"/>
-      <w:r>
-        <w:rPr>
-          <w:b/>
-          <w:bCs/>
-        </w:rPr>
-        <w:t>ms</w:t>
-      </w:r>
-      <w:proofErr w:type="spellEnd"/>
+        <w:t>34 ms</w:t>
+      </w:r>
       <w:r>
         <w:t> on standard CPU hardware via ONNX Runtime.</w:t>
       </w:r>
@@ -17332,23 +15425,7 @@
           <w:b/>
           <w:bCs/>
         </w:rPr>
-        <w:t xml:space="preserve">56 </w:t>
-      </w:r>
-      <w:proofErr w:type="spellStart"/>
-      <w:r>
-        <w:rPr>
-          <w:b/>
-          <w:bCs/>
-        </w:rPr>
-        <w:t>ms</w:t>
-      </w:r>
-      <w:proofErr w:type="spellEnd"/>
-      <w:r>
-        <w:rPr>
-          <w:b/>
-          <w:bCs/>
-        </w:rPr>
-        <w:t xml:space="preserve"> average</w:t>
+        <w:t>56 ms average</w:t>
       </w:r>
       <w:r>
         <w:t>, making real-time review moderation highly viable.</w:t>
@@ -17458,15 +15535,7 @@
         <w:t>Sentiment Moderation:</w:t>
       </w:r>
       <w:r>
-        <w:t xml:space="preserve"> The project met its objective of multilingual community feedback control. The model's ability to output a multi-label ranking (e.g., detecting both disgust and frustration simultaneously) proves highly effective for flagging high-risk vendor behavior to administrators, even if the </w:t>
-      </w:r>
-      <w:proofErr w:type="gramStart"/>
-      <w:r>
-        <w:t>top-1</w:t>
-      </w:r>
-      <w:proofErr w:type="gramEnd"/>
-      <w:r>
-        <w:t xml:space="preserve"> zero-shot accuracy (46.7%) leaves room for future fine-tuning.</w:t>
+        <w:t> The project met its objective of multilingual community feedback control. The model's ability to output a multi-label ranking (e.g., detecting both disgust and frustration simultaneously) proves highly effective for flagging high-risk vendor behavior to administrators, even if the top-1 zero-shot accuracy (46.7%) leaves room for future fine-tuning.</w:t>
       </w:r>
     </w:p>
     <w:p>
@@ -17652,15 +15721,7 @@
               <w:cnfStyle w:val="000000000000" w:firstRow="0" w:lastRow="0" w:firstColumn="0" w:lastColumn="0" w:oddVBand="0" w:evenVBand="0" w:oddHBand="0" w:evenHBand="0" w:firstRowFirstColumn="0" w:firstRowLastColumn="0" w:lastRowFirstColumn="0" w:lastRowLastColumn="0"/>
             </w:pPr>
             <w:r>
-              <w:t xml:space="preserve">46.7% </w:t>
-            </w:r>
-            <w:proofErr w:type="gramStart"/>
-            <w:r>
-              <w:t>top-1</w:t>
-            </w:r>
-            <w:proofErr w:type="gramEnd"/>
-            <w:r>
-              <w:t xml:space="preserve"> zero-shot accuracy.</w:t>
+              <w:t>46.7% top-1 zero-shot accuracy.</w:t>
             </w:r>
           </w:p>
         </w:tc>
@@ -17750,17 +15811,8 @@
                 <w:b/>
                 <w:bCs/>
               </w:rPr>
-              <w:t xml:space="preserve">Backend — </w:t>
-            </w:r>
-            <w:proofErr w:type="spellStart"/>
-            <w:r>
-              <w:rPr>
-                <w:b/>
-                <w:bCs/>
-              </w:rPr>
-              <w:t>SignalR</w:t>
-            </w:r>
-            <w:proofErr w:type="spellEnd"/>
+              <w:t>Backend — SignalR</w:t>
+            </w:r>
           </w:p>
         </w:tc>
         <w:tc>
@@ -17967,23 +16019,7 @@
         <w:t>Multi-Component System Architecture</w:t>
       </w:r>
       <w:r>
-        <w:t xml:space="preserve">: A distributed, independently deployable system comprising an ASP.NET Core Web API, Python </w:t>
-      </w:r>
-      <w:proofErr w:type="spellStart"/>
-      <w:r>
-        <w:t>FastAPI</w:t>
-      </w:r>
-      <w:proofErr w:type="spellEnd"/>
-      <w:r>
-        <w:t xml:space="preserve"> microservice, </w:t>
-      </w:r>
-      <w:proofErr w:type="gramStart"/>
-      <w:r>
-        <w:t>React</w:t>
-      </w:r>
-      <w:proofErr w:type="gramEnd"/>
-      <w:r>
-        <w:t xml:space="preserve"> admin panel, and Flutter mobile application — all communicating through a shared REST API layer.</w:t>
+        <w:t>: A distributed, independently deployable system comprising an ASP.NET Core Web API, Python FastAPI microservice, React admin panel, and Flutter mobile application — all communicating through a shared REST API layer.</w:t>
       </w:r>
     </w:p>
     <w:p>
@@ -18019,15 +16055,7 @@
         <w:t>Multilingual Sentiment Moderation</w:t>
       </w:r>
       <w:r>
-        <w:t xml:space="preserve">: A zero-shot NLP pipeline was deployed to classify Arabic and English customer reviews into six actionable emotional tags in real time (56 </w:t>
-      </w:r>
-      <w:proofErr w:type="spellStart"/>
-      <w:r>
-        <w:t>ms</w:t>
-      </w:r>
-      <w:proofErr w:type="spellEnd"/>
-      <w:r>
-        <w:t xml:space="preserve"> latency). This enables administrators to prioritize high-risk complaints automatically.</w:t>
+        <w:t>: A zero-shot NLP pipeline was deployed to classify Arabic and English customer reviews into six actionable emotional tags in real time (56 ms latency). This enables administrators to prioritize high-risk complaints automatically.</w:t>
       </w:r>
     </w:p>
     <w:p>
@@ -18210,15 +16238,7 @@
               <w:t>Online Payment Gateway</w:t>
             </w:r>
             <w:r>
-              <w:t xml:space="preserve"> (e.g., </w:t>
-            </w:r>
-            <w:proofErr w:type="spellStart"/>
-            <w:r>
-              <w:t>Paymob</w:t>
-            </w:r>
-            <w:proofErr w:type="spellEnd"/>
-            <w:r>
-              <w:t xml:space="preserve"> / Stripe)</w:t>
+              <w:t> (e.g., Paymob / Stripe)</w:t>
             </w:r>
           </w:p>
         </w:tc>
@@ -18573,15 +16593,7 @@
               <w:cnfStyle w:val="000000100000" w:firstRow="0" w:lastRow="0" w:firstColumn="0" w:lastColumn="0" w:oddVBand="0" w:evenVBand="0" w:oddHBand="1" w:evenHBand="0" w:firstRowFirstColumn="0" w:firstRowLastColumn="0" w:lastRowFirstColumn="0" w:lastRowLastColumn="0"/>
             </w:pPr>
             <w:r>
-              <w:t xml:space="preserve">Award points for food rescue activity to </w:t>
-            </w:r>
-            <w:proofErr w:type="gramStart"/>
-            <w:r>
-              <w:t>incentivize</w:t>
-            </w:r>
-            <w:proofErr w:type="gramEnd"/>
-            <w:r>
-              <w:t xml:space="preserve"> repeat purchases and increase user retention.</w:t>
+              <w:t>Award points for food rescue activity to incentivize repeat purchases and increase user retention.</w:t>
             </w:r>
           </w:p>
         </w:tc>
@@ -18683,15 +16695,7 @@
         <w:jc w:val="left"/>
       </w:pPr>
       <w:r>
-        <w:t xml:space="preserve">United Nations Environment </w:t>
-      </w:r>
-      <w:proofErr w:type="spellStart"/>
-      <w:r>
-        <w:t>Programme</w:t>
-      </w:r>
-      <w:proofErr w:type="spellEnd"/>
-      <w:r>
-        <w:t xml:space="preserve"> (UNEP). (n.d.). </w:t>
+        <w:t>United Nations Environment Programme (UNEP). (n.d.). </w:t>
       </w:r>
       <w:r>
         <w:rPr>

</xml_diff>